<commit_message>
New design for Title screen
</commit_message>
<xml_diff>
--- a/docs/Relatorio-PAP.docx
+++ b/docs/Relatorio-PAP.docx
@@ -6,6 +6,7 @@
       <w:pPr>
         <w:jc w:val="center"/>
         <w:rPr>
+          <w:rFonts w:ascii="Times New Roman" w:hAnsi="Times New Roman" w:cs="Times New Roman"/>
           <w:b/>
           <w:bCs/>
           <w:sz w:val="32"/>
@@ -14,6 +15,7 @@
       </w:pPr>
       <w:r>
         <w:rPr>
+          <w:rFonts w:ascii="Times New Roman" w:hAnsi="Times New Roman" w:cs="Times New Roman"/>
           <w:b/>
           <w:bCs/>
           <w:sz w:val="32"/>
@@ -21,19 +23,19 @@
         </w:rPr>
         <w:t xml:space="preserve">Escola </w:t>
       </w:r>
-      <w:proofErr w:type="gramStart"/>
-      <w:r>
-        <w:rPr>
+      <w:r>
+        <w:rPr>
+          <w:rFonts w:ascii="Times New Roman" w:hAnsi="Times New Roman" w:cs="Times New Roman"/>
           <w:b/>
           <w:bCs/>
           <w:sz w:val="32"/>
           <w:szCs w:val="32"/>
         </w:rPr>
-        <w:t>Secundária  António</w:t>
-      </w:r>
-      <w:proofErr w:type="gramEnd"/>
-      <w:r>
-        <w:rPr>
+        <w:t>Secundária António</w:t>
+      </w:r>
+      <w:r>
+        <w:rPr>
+          <w:rFonts w:ascii="Times New Roman" w:hAnsi="Times New Roman" w:cs="Times New Roman"/>
           <w:b/>
           <w:bCs/>
           <w:sz w:val="32"/>
@@ -46,6 +48,7 @@
       <w:pPr>
         <w:jc w:val="center"/>
         <w:rPr>
+          <w:rFonts w:ascii="Times New Roman" w:hAnsi="Times New Roman" w:cs="Times New Roman"/>
           <w:b/>
           <w:bCs/>
           <w:sz w:val="28"/>
@@ -54,6 +57,7 @@
       </w:pPr>
       <w:r>
         <w:rPr>
+          <w:rFonts w:ascii="Times New Roman" w:hAnsi="Times New Roman" w:cs="Times New Roman"/>
           <w:b/>
           <w:bCs/>
           <w:sz w:val="28"/>
@@ -66,6 +70,7 @@
       <w:pPr>
         <w:jc w:val="center"/>
         <w:rPr>
+          <w:rFonts w:ascii="Times New Roman" w:hAnsi="Times New Roman" w:cs="Times New Roman"/>
           <w:b/>
           <w:bCs/>
           <w:sz w:val="28"/>
@@ -77,6 +82,7 @@
       <w:pPr>
         <w:jc w:val="center"/>
         <w:rPr>
+          <w:rFonts w:ascii="Times New Roman" w:hAnsi="Times New Roman" w:cs="Times New Roman"/>
           <w:b/>
           <w:bCs/>
           <w:sz w:val="28"/>
@@ -88,6 +94,7 @@
       <w:pPr>
         <w:jc w:val="center"/>
         <w:rPr>
+          <w:rFonts w:ascii="Times New Roman" w:hAnsi="Times New Roman" w:cs="Times New Roman"/>
           <w:b/>
           <w:bCs/>
           <w:sz w:val="28"/>
@@ -96,6 +103,7 @@
       </w:pPr>
       <w:r>
         <w:rPr>
+          <w:rFonts w:ascii="Times New Roman" w:hAnsi="Times New Roman" w:cs="Times New Roman"/>
           <w:b/>
           <w:bCs/>
           <w:sz w:val="28"/>
@@ -108,6 +116,7 @@
       <w:pPr>
         <w:jc w:val="center"/>
         <w:rPr>
+          <w:rFonts w:ascii="Times New Roman" w:hAnsi="Times New Roman" w:cs="Times New Roman"/>
           <w:b/>
           <w:bCs/>
           <w:sz w:val="28"/>
@@ -119,6 +128,7 @@
       <w:pPr>
         <w:jc w:val="center"/>
         <w:rPr>
+          <w:rFonts w:ascii="Times New Roman" w:hAnsi="Times New Roman" w:cs="Times New Roman"/>
           <w:b/>
           <w:bCs/>
           <w:sz w:val="28"/>
@@ -127,6 +137,7 @@
       </w:pPr>
       <w:r>
         <w:rPr>
+          <w:rFonts w:ascii="Times New Roman" w:hAnsi="Times New Roman" w:cs="Times New Roman"/>
           <w:b/>
           <w:bCs/>
           <w:sz w:val="28"/>
@@ -137,6 +148,7 @@
       <w:proofErr w:type="spellStart"/>
       <w:r>
         <w:rPr>
+          <w:rFonts w:ascii="Times New Roman" w:hAnsi="Times New Roman" w:cs="Times New Roman"/>
           <w:b/>
           <w:bCs/>
           <w:sz w:val="28"/>
@@ -147,6 +159,7 @@
       <w:proofErr w:type="spellEnd"/>
       <w:r>
         <w:rPr>
+          <w:rFonts w:ascii="Times New Roman" w:hAnsi="Times New Roman" w:cs="Times New Roman"/>
           <w:b/>
           <w:bCs/>
           <w:sz w:val="28"/>
@@ -158,9 +171,13 @@
     <w:p>
       <w:pPr>
         <w:jc w:val="center"/>
-      </w:pPr>
-      <w:r>
-        <w:rPr>
+        <w:rPr>
+          <w:rFonts w:ascii="Times New Roman" w:hAnsi="Times New Roman" w:cs="Times New Roman"/>
+        </w:rPr>
+      </w:pPr>
+      <w:r>
+        <w:rPr>
+          <w:rFonts w:ascii="Times New Roman" w:hAnsi="Times New Roman" w:cs="Times New Roman"/>
           <w:noProof/>
         </w:rPr>
         <w:drawing>
@@ -181,7 +198,7 @@
                     </pic:cNvPicPr>
                   </pic:nvPicPr>
                   <pic:blipFill>
-                    <a:blip r:embed="rId6" cstate="print">
+                    <a:blip r:embed="rId8" cstate="print">
                       <a:extLst>
                         <a:ext uri="{28A0092B-C50C-407E-A947-70E740481C1C}">
                           <a14:useLocalDpi xmlns:a14="http://schemas.microsoft.com/office/drawing/2010/main" val="0"/>
@@ -216,8 +233,14 @@
     <w:p>
       <w:pPr>
         <w:jc w:val="center"/>
-      </w:pPr>
-      <w:r>
+        <w:rPr>
+          <w:rFonts w:ascii="Times New Roman" w:hAnsi="Times New Roman" w:cs="Times New Roman"/>
+        </w:rPr>
+      </w:pPr>
+      <w:r>
+        <w:rPr>
+          <w:rFonts w:ascii="Times New Roman" w:hAnsi="Times New Roman" w:cs="Times New Roman"/>
+        </w:rPr>
         <w:t>Marcel Gomes Nº8 12º PSI</w:t>
       </w:r>
     </w:p>
@@ -243,14 +266,16 @@
           <w:rFonts w:ascii="Times New Roman" w:hAnsi="Times New Roman" w:cs="Times New Roman"/>
           <w:b/>
           <w:bCs/>
-        </w:rPr>
-      </w:pPr>
-      <w:bookmarkStart w:id="0" w:name="_Toc221641314"/>
+          <w:color w:val="auto"/>
+        </w:rPr>
+      </w:pPr>
+      <w:bookmarkStart w:id="0" w:name="_Toc225346768"/>
       <w:r>
         <w:rPr>
           <w:rFonts w:ascii="Times New Roman" w:hAnsi="Times New Roman" w:cs="Times New Roman"/>
           <w:b/>
           <w:bCs/>
+          <w:color w:val="auto"/>
         </w:rPr>
         <w:lastRenderedPageBreak/>
         <w:t>Agradecimentos</w:t>
@@ -269,14 +294,16 @@
           <w:rFonts w:ascii="Times New Roman" w:hAnsi="Times New Roman" w:cs="Times New Roman"/>
           <w:b/>
           <w:bCs/>
-        </w:rPr>
-      </w:pPr>
-      <w:bookmarkStart w:id="1" w:name="_Toc221641315"/>
+          <w:color w:val="auto"/>
+        </w:rPr>
+      </w:pPr>
+      <w:bookmarkStart w:id="1" w:name="_Toc225346769"/>
       <w:r>
         <w:rPr>
           <w:rFonts w:ascii="Times New Roman" w:hAnsi="Times New Roman" w:cs="Times New Roman"/>
           <w:b/>
           <w:bCs/>
+          <w:color w:val="auto"/>
         </w:rPr>
         <w:lastRenderedPageBreak/>
         <w:t>Resumo</w:t>
@@ -295,15 +322,17 @@
           <w:rFonts w:ascii="Times New Roman" w:hAnsi="Times New Roman" w:cs="Times New Roman"/>
           <w:b/>
           <w:bCs/>
+          <w:color w:val="auto"/>
           <w:u w:val="single"/>
         </w:rPr>
       </w:pPr>
-      <w:bookmarkStart w:id="2" w:name="_Toc221641316"/>
+      <w:bookmarkStart w:id="2" w:name="_Toc225346770"/>
       <w:r>
         <w:rPr>
           <w:rFonts w:ascii="Times New Roman" w:hAnsi="Times New Roman" w:cs="Times New Roman"/>
           <w:b/>
           <w:bCs/>
+          <w:color w:val="auto"/>
         </w:rPr>
         <w:lastRenderedPageBreak/>
         <w:t>Lista de Abreviaturas</w:t>
@@ -339,7 +368,7 @@
           <w:bCs/>
         </w:rPr>
       </w:pPr>
-      <w:bookmarkStart w:id="3" w:name="_Toc221641317"/>
+      <w:bookmarkStart w:id="3" w:name="_Toc225346771"/>
       <w:r>
         <w:rPr>
           <w:rFonts w:ascii="Times New Roman" w:hAnsi="Times New Roman" w:cs="Times New Roman"/>
@@ -395,7 +424,7 @@
           <w:lang w:eastAsia="pt-PT"/>
         </w:rPr>
       </w:pPr>
-      <w:bookmarkStart w:id="4" w:name="_Toc221641318"/>
+      <w:bookmarkStart w:id="4" w:name="_Toc225346772"/>
       <w:r>
         <w:rPr>
           <w:rFonts w:ascii="Times New Roman" w:eastAsia="Times New Roman" w:hAnsi="Times New Roman" w:cs="Times New Roman"/>
@@ -594,12 +623,166 @@
       <w:pPr>
         <w:jc w:val="both"/>
       </w:pPr>
+    </w:p>
+    <w:p>
+      <w:pPr>
+        <w:pStyle w:val="Ttulo2"/>
+        <w:numPr>
+          <w:ilvl w:val="1"/>
+          <w:numId w:val="32"/>
+        </w:numPr>
+      </w:pPr>
       <w:r>
         <w:br w:type="page"/>
       </w:r>
+      <w:bookmarkStart w:id="5" w:name="_Toc225346774"/>
+      <w:r>
+        <w:lastRenderedPageBreak/>
+        <w:t>Fundamentação d</w:t>
+      </w:r>
+      <w:r>
+        <w:t>a</w:t>
+      </w:r>
+      <w:r>
+        <w:t xml:space="preserve"> </w:t>
+      </w:r>
+      <w:r>
+        <w:t>Escolha do Projeto</w:t>
+      </w:r>
+      <w:bookmarkEnd w:id="5"/>
+    </w:p>
+    <w:p>
+      <w:pPr>
+        <w:spacing w:after="0" w:line="240" w:lineRule="auto"/>
+        <w:ind w:firstLine="360"/>
+        <w:rPr>
+          <w:rFonts w:ascii="Times New Roman" w:eastAsia="Times New Roman" w:hAnsi="Times New Roman" w:cs="Times New Roman"/>
+          <w:sz w:val="24"/>
+          <w:szCs w:val="24"/>
+          <w:lang w:eastAsia="pt-PT"/>
+        </w:rPr>
+      </w:pPr>
+      <w:r>
+        <w:rPr>
+          <w:rFonts w:ascii="Times New Roman" w:eastAsia="Times New Roman" w:hAnsi="Times New Roman" w:cs="Times New Roman"/>
+          <w:sz w:val="24"/>
+          <w:szCs w:val="24"/>
+          <w:lang w:eastAsia="pt-PT"/>
+        </w:rPr>
+        <w:t xml:space="preserve">A escolha do tema recaiu sobre o desenvolvimento de um videojogo devido à sua natureza multidisciplinar, que combina programação, design gráfico, narrativa, lógica, criatividade e resolução de problemas. Optar por um </w:t>
+      </w:r>
+      <w:proofErr w:type="spellStart"/>
+      <w:r>
+        <w:rPr>
+          <w:rFonts w:ascii="Times New Roman" w:eastAsia="Times New Roman" w:hAnsi="Times New Roman" w:cs="Times New Roman"/>
+          <w:sz w:val="24"/>
+          <w:szCs w:val="24"/>
+          <w:lang w:eastAsia="pt-PT"/>
+        </w:rPr>
+        <w:t>Metroidvania</w:t>
+      </w:r>
+      <w:proofErr w:type="spellEnd"/>
+      <w:r>
+        <w:rPr>
+          <w:rFonts w:ascii="Times New Roman" w:eastAsia="Times New Roman" w:hAnsi="Times New Roman" w:cs="Times New Roman"/>
+          <w:sz w:val="24"/>
+          <w:szCs w:val="24"/>
+          <w:lang w:eastAsia="pt-PT"/>
+        </w:rPr>
+        <w:t xml:space="preserve"> 2D permite explorar uma vasta gama de desafios técnicos e criativos inerentes ao game design moderno, tais como a implementação de máquinas de estado, físicas personalizadas, gestão de cenas e sistemas de progressão não-linear, demonstrando de forma abrangente as competências adquiridas ao longo do curso.</w:t>
+      </w:r>
+    </w:p>
+    <w:p>
+      <w:pPr>
+        <w:pStyle w:val="Ttulo2"/>
+      </w:pPr>
+      <w:r>
+        <w:br w:type="page"/>
+      </w:r>
+      <w:bookmarkStart w:id="6" w:name="_Toc225346775"/>
+      <w:r>
+        <w:lastRenderedPageBreak/>
+        <w:t xml:space="preserve">1.2 </w:t>
+      </w:r>
+      <w:r>
+        <w:t>Finalidades do Projeto</w:t>
+      </w:r>
+      <w:bookmarkEnd w:id="6"/>
+    </w:p>
+    <w:p>
+      <w:pPr>
+        <w:ind w:firstLine="708"/>
+        <w:rPr>
+          <w:lang w:eastAsia="pt-PT"/>
+        </w:rPr>
+      </w:pPr>
+      <w:r>
+        <w:rPr>
+          <w:lang w:eastAsia="pt-PT"/>
+        </w:rPr>
+        <w:t>Este projeto tem como finalidade principal a criação de um protótipo funcional e robusto de um jogo 2D, servindo como prova prática das capacidades de desenvolvimento de software, gestão de projeto e pensamento crítico. Visa também consolidar aprendizagens das diversas disciplinas do curso num produto tangível e com potencial de evolução.</w:t>
+      </w:r>
+    </w:p>
+    <w:p>
+      <w:pPr>
+        <w:rPr>
+          <w:rFonts w:ascii="Times New Roman" w:eastAsiaTheme="majorEastAsia" w:hAnsi="Times New Roman" w:cs="Times New Roman"/>
+          <w:b/>
+          <w:bCs/>
+          <w:color w:val="000000" w:themeColor="text1"/>
+          <w:sz w:val="32"/>
+          <w:szCs w:val="32"/>
+        </w:rPr>
+      </w:pPr>
+      <w:r>
+        <w:rPr>
+          <w:rFonts w:ascii="Times New Roman" w:hAnsi="Times New Roman" w:cs="Times New Roman"/>
+          <w:b/>
+          <w:bCs/>
+          <w:color w:val="000000" w:themeColor="text1"/>
+        </w:rPr>
+        <w:br w:type="page"/>
+      </w:r>
+    </w:p>
+    <w:p>
+      <w:pPr>
+        <w:rPr>
+          <w:lang w:eastAsia="pt-PT"/>
+        </w:rPr>
+      </w:pPr>
+    </w:p>
+    <w:p>
+      <w:pPr>
+        <w:jc w:val="both"/>
+      </w:pPr>
+    </w:p>
+    <w:p>
+      <w:pPr>
+        <w:pStyle w:val="Ttulo1"/>
+        <w:rPr>
+          <w:rFonts w:ascii="Times New Roman" w:hAnsi="Times New Roman" w:cs="Times New Roman"/>
+        </w:rPr>
+      </w:pPr>
+      <w:bookmarkStart w:id="7" w:name="_Toc225346773"/>
+      <w:r>
+        <w:rPr>
+          <w:rFonts w:ascii="Times New Roman" w:hAnsi="Times New Roman" w:cs="Times New Roman"/>
+        </w:rPr>
+        <w:t>Índice</w:t>
+      </w:r>
+      <w:bookmarkEnd w:id="7"/>
     </w:p>
     <w:sdt>
       <w:sdtPr>
+        <w:rPr>
+          <w:rFonts w:asciiTheme="minorHAnsi" w:eastAsiaTheme="minorHAnsi" w:hAnsiTheme="minorHAnsi" w:cstheme="minorBidi"/>
+          <w:b/>
+          <w:bCs/>
+          <w:color w:val="auto"/>
+          <w:sz w:val="22"/>
+          <w:szCs w:val="22"/>
+          <w:lang w:eastAsia="en-US"/>
+        </w:rPr>
         <w:id w:val="274523084"/>
         <w:docPartObj>
           <w:docPartGallery w:val="Table of Contents"/>
@@ -608,23 +791,22 @@
       </w:sdtPr>
       <w:sdtEndPr>
         <w:rPr>
-          <w:rFonts w:asciiTheme="minorHAnsi" w:eastAsiaTheme="minorHAnsi" w:hAnsiTheme="minorHAnsi" w:cstheme="minorBidi"/>
-          <w:b/>
-          <w:bCs/>
-          <w:color w:val="auto"/>
-          <w:sz w:val="22"/>
-          <w:szCs w:val="22"/>
-          <w:lang w:eastAsia="en-US"/>
+          <w:rFonts w:ascii="Times New Roman" w:hAnsi="Times New Roman" w:cs="Times New Roman"/>
+          <w:b w:val="0"/>
+          <w:bCs w:val="0"/>
         </w:rPr>
       </w:sdtEndPr>
       <w:sdtContent>
         <w:p>
           <w:pPr>
             <w:pStyle w:val="Cabealhodondice"/>
+            <w:rPr>
+              <w:rFonts w:ascii="Times New Roman" w:hAnsi="Times New Roman" w:cs="Times New Roman"/>
+              <w:b/>
+              <w:bCs/>
+              <w:color w:val="auto"/>
+            </w:rPr>
           </w:pPr>
-          <w:r>
-            <w:t>Índice</w:t>
-          </w:r>
         </w:p>
         <w:p>
           <w:pPr>
@@ -639,15 +821,24 @@
             </w:rPr>
           </w:pPr>
           <w:r>
+            <w:rPr>
+              <w:rFonts w:ascii="Times New Roman" w:hAnsi="Times New Roman" w:cs="Times New Roman"/>
+            </w:rPr>
             <w:fldChar w:fldCharType="begin"/>
           </w:r>
           <w:r>
+            <w:rPr>
+              <w:rFonts w:ascii="Times New Roman" w:hAnsi="Times New Roman" w:cs="Times New Roman"/>
+            </w:rPr>
             <w:instrText xml:space="preserve"> TOC \o "1-3" \h \z \u </w:instrText>
           </w:r>
           <w:r>
+            <w:rPr>
+              <w:rFonts w:ascii="Times New Roman" w:hAnsi="Times New Roman" w:cs="Times New Roman"/>
+            </w:rPr>
             <w:fldChar w:fldCharType="separate"/>
           </w:r>
-          <w:hyperlink w:anchor="_Toc221641314" w:history="1">
+          <w:hyperlink w:anchor="_Toc225346768" w:history="1">
             <w:r>
               <w:rPr>
                 <w:rStyle w:val="Hiperligao"/>
@@ -677,7 +868,7 @@
                 <w:noProof/>
                 <w:webHidden/>
               </w:rPr>
-              <w:instrText xml:space="preserve"> PAGEREF _Toc221641314 \h </w:instrText>
+              <w:instrText xml:space="preserve"> PAGEREF _Toc225346768 \h </w:instrText>
             </w:r>
             <w:r>
               <w:rPr>
@@ -720,7 +911,7 @@
               <w:lang w:eastAsia="pt-PT"/>
             </w:rPr>
           </w:pPr>
-          <w:hyperlink w:anchor="_Toc221641315" w:history="1">
+          <w:hyperlink w:anchor="_Toc225346769" w:history="1">
             <w:r>
               <w:rPr>
                 <w:rStyle w:val="Hiperligao"/>
@@ -750,7 +941,7 @@
                 <w:noProof/>
                 <w:webHidden/>
               </w:rPr>
-              <w:instrText xml:space="preserve"> PAGEREF _Toc221641315 \h </w:instrText>
+              <w:instrText xml:space="preserve"> PAGEREF _Toc225346769 \h </w:instrText>
             </w:r>
             <w:r>
               <w:rPr>
@@ -793,7 +984,7 @@
               <w:lang w:eastAsia="pt-PT"/>
             </w:rPr>
           </w:pPr>
-          <w:hyperlink w:anchor="_Toc221641316" w:history="1">
+          <w:hyperlink w:anchor="_Toc225346770" w:history="1">
             <w:r>
               <w:rPr>
                 <w:rStyle w:val="Hiperligao"/>
@@ -823,7 +1014,7 @@
                 <w:noProof/>
                 <w:webHidden/>
               </w:rPr>
-              <w:instrText xml:space="preserve"> PAGEREF _Toc221641316 \h </w:instrText>
+              <w:instrText xml:space="preserve"> PAGEREF _Toc225346770 \h </w:instrText>
             </w:r>
             <w:r>
               <w:rPr>
@@ -866,7 +1057,7 @@
               <w:lang w:eastAsia="pt-PT"/>
             </w:rPr>
           </w:pPr>
-          <w:hyperlink w:anchor="_Toc221641317" w:history="1">
+          <w:hyperlink w:anchor="_Toc225346771" w:history="1">
             <w:r>
               <w:rPr>
                 <w:rStyle w:val="Hiperligao"/>
@@ -896,7 +1087,7 @@
                 <w:noProof/>
                 <w:webHidden/>
               </w:rPr>
-              <w:instrText xml:space="preserve"> PAGEREF _Toc221641317 \h </w:instrText>
+              <w:instrText xml:space="preserve"> PAGEREF _Toc225346771 \h </w:instrText>
             </w:r>
             <w:r>
               <w:rPr>
@@ -939,7 +1130,7 @@
               <w:lang w:eastAsia="pt-PT"/>
             </w:rPr>
           </w:pPr>
-          <w:hyperlink w:anchor="_Toc221641318" w:history="1">
+          <w:hyperlink w:anchor="_Toc225346772" w:history="1">
             <w:r>
               <w:rPr>
                 <w:rStyle w:val="Hiperligao"/>
@@ -950,7 +1141,7 @@
                 <w:kern w:val="36"/>
                 <w:lang w:eastAsia="pt-PT"/>
               </w:rPr>
-              <w:t>Introdução</w:t>
+              <w:t>1.Introdução</w:t>
             </w:r>
             <w:r>
               <w:rPr>
@@ -971,7 +1162,7 @@
                 <w:noProof/>
                 <w:webHidden/>
               </w:rPr>
-              <w:instrText xml:space="preserve"> PAGEREF _Toc221641318 \h </w:instrText>
+              <w:instrText xml:space="preserve"> PAGEREF _Toc225346772 \h </w:instrText>
             </w:r>
             <w:r>
               <w:rPr>
@@ -1014,16 +1205,14 @@
               <w:lang w:eastAsia="pt-PT"/>
             </w:rPr>
           </w:pPr>
-          <w:hyperlink w:anchor="_Toc221641319" w:history="1">
+          <w:hyperlink w:anchor="_Toc225346773" w:history="1">
             <w:r>
               <w:rPr>
                 <w:rStyle w:val="Hiperligao"/>
                 <w:rFonts w:ascii="Times New Roman" w:hAnsi="Times New Roman" w:cs="Times New Roman"/>
-                <w:b/>
-                <w:bCs/>
-                <w:noProof/>
-              </w:rPr>
-              <w:t>Prova de Aptidão Profissional</w:t>
+                <w:noProof/>
+              </w:rPr>
+              <w:t>Índice</w:t>
             </w:r>
             <w:r>
               <w:rPr>
@@ -1044,7 +1233,7 @@
                 <w:noProof/>
                 <w:webHidden/>
               </w:rPr>
-              <w:instrText xml:space="preserve"> PAGEREF _Toc221641319 \h </w:instrText>
+              <w:instrText xml:space="preserve"> PAGEREF _Toc225346773 \h </w:instrText>
             </w:r>
             <w:r>
               <w:rPr>
@@ -1064,7 +1253,163 @@
                 <w:noProof/>
                 <w:webHidden/>
               </w:rPr>
+              <w:t>8</w:t>
+            </w:r>
+            <w:r>
+              <w:rPr>
+                <w:noProof/>
+                <w:webHidden/>
+              </w:rPr>
+              <w:fldChar w:fldCharType="end"/>
+            </w:r>
+          </w:hyperlink>
+        </w:p>
+        <w:p>
+          <w:pPr>
+            <w:pStyle w:val="ndice2"/>
+            <w:tabs>
+              <w:tab w:val="left" w:pos="880"/>
+              <w:tab w:val="right" w:leader="dot" w:pos="8494"/>
+            </w:tabs>
+            <w:rPr>
+              <w:rFonts w:eastAsiaTheme="minorEastAsia"/>
+              <w:noProof/>
+              <w:lang w:eastAsia="pt-PT"/>
+            </w:rPr>
+          </w:pPr>
+          <w:hyperlink w:anchor="_Toc225346774" w:history="1">
+            <w:r>
+              <w:rPr>
+                <w:rStyle w:val="Hiperligao"/>
+                <w:noProof/>
+              </w:rPr>
+              <w:t>1.1.</w:t>
+            </w:r>
+            <w:r>
+              <w:rPr>
+                <w:rFonts w:eastAsiaTheme="minorEastAsia"/>
+                <w:noProof/>
+                <w:lang w:eastAsia="pt-PT"/>
+              </w:rPr>
+              <w:tab/>
+            </w:r>
+            <w:r>
+              <w:rPr>
+                <w:rStyle w:val="Hiperligao"/>
+                <w:noProof/>
+              </w:rPr>
+              <w:t>Fundamentação da Escolha do Projeto</w:t>
+            </w:r>
+            <w:r>
+              <w:rPr>
+                <w:noProof/>
+                <w:webHidden/>
+              </w:rPr>
+              <w:tab/>
+            </w:r>
+            <w:r>
+              <w:rPr>
+                <w:noProof/>
+                <w:webHidden/>
+              </w:rPr>
+              <w:fldChar w:fldCharType="begin"/>
+            </w:r>
+            <w:r>
+              <w:rPr>
+                <w:noProof/>
+                <w:webHidden/>
+              </w:rPr>
+              <w:instrText xml:space="preserve"> PAGEREF _Toc225346774 \h </w:instrText>
+            </w:r>
+            <w:r>
+              <w:rPr>
+                <w:noProof/>
+                <w:webHidden/>
+              </w:rPr>
+            </w:r>
+            <w:r>
+              <w:rPr>
+                <w:noProof/>
+                <w:webHidden/>
+              </w:rPr>
+              <w:fldChar w:fldCharType="separate"/>
+            </w:r>
+            <w:r>
+              <w:rPr>
+                <w:noProof/>
+                <w:webHidden/>
+              </w:rPr>
               <w:t>11</w:t>
+            </w:r>
+            <w:r>
+              <w:rPr>
+                <w:noProof/>
+                <w:webHidden/>
+              </w:rPr>
+              <w:fldChar w:fldCharType="end"/>
+            </w:r>
+          </w:hyperlink>
+        </w:p>
+        <w:p>
+          <w:pPr>
+            <w:pStyle w:val="ndice2"/>
+            <w:tabs>
+              <w:tab w:val="right" w:leader="dot" w:pos="8494"/>
+            </w:tabs>
+            <w:rPr>
+              <w:rFonts w:eastAsiaTheme="minorEastAsia"/>
+              <w:noProof/>
+              <w:lang w:eastAsia="pt-PT"/>
+            </w:rPr>
+          </w:pPr>
+          <w:hyperlink w:anchor="_Toc225346775" w:history="1">
+            <w:r>
+              <w:rPr>
+                <w:rStyle w:val="Hiperligao"/>
+                <w:noProof/>
+              </w:rPr>
+              <w:t>1.2 Finalidades do Projeto</w:t>
+            </w:r>
+            <w:r>
+              <w:rPr>
+                <w:noProof/>
+                <w:webHidden/>
+              </w:rPr>
+              <w:tab/>
+            </w:r>
+            <w:r>
+              <w:rPr>
+                <w:noProof/>
+                <w:webHidden/>
+              </w:rPr>
+              <w:fldChar w:fldCharType="begin"/>
+            </w:r>
+            <w:r>
+              <w:rPr>
+                <w:noProof/>
+                <w:webHidden/>
+              </w:rPr>
+              <w:instrText xml:space="preserve"> PAGEREF _Toc225346775 \h </w:instrText>
+            </w:r>
+            <w:r>
+              <w:rPr>
+                <w:noProof/>
+                <w:webHidden/>
+              </w:rPr>
+            </w:r>
+            <w:r>
+              <w:rPr>
+                <w:noProof/>
+                <w:webHidden/>
+              </w:rPr>
+              <w:fldChar w:fldCharType="separate"/>
+            </w:r>
+            <w:r>
+              <w:rPr>
+                <w:noProof/>
+                <w:webHidden/>
+              </w:rPr>
+              <w:t>12</w:t>
             </w:r>
             <w:r>
               <w:rPr>
@@ -1087,7 +1432,7 @@
               <w:lang w:eastAsia="pt-PT"/>
             </w:rPr>
           </w:pPr>
-          <w:hyperlink w:anchor="_Toc221641320" w:history="1">
+          <w:hyperlink w:anchor="_Toc225346776" w:history="1">
             <w:r>
               <w:rPr>
                 <w:rStyle w:val="Hiperligao"/>
@@ -1096,6 +1441,97 @@
                 <w:bCs/>
                 <w:noProof/>
               </w:rPr>
+              <w:t>2.Prova de Aptidão Profissional</w:t>
+            </w:r>
+            <w:r>
+              <w:rPr>
+                <w:noProof/>
+                <w:webHidden/>
+              </w:rPr>
+              <w:tab/>
+            </w:r>
+            <w:r>
+              <w:rPr>
+                <w:noProof/>
+                <w:webHidden/>
+              </w:rPr>
+              <w:fldChar w:fldCharType="begin"/>
+            </w:r>
+            <w:r>
+              <w:rPr>
+                <w:noProof/>
+                <w:webHidden/>
+              </w:rPr>
+              <w:instrText xml:space="preserve"> PAGEREF _Toc225346776 \h </w:instrText>
+            </w:r>
+            <w:r>
+              <w:rPr>
+                <w:noProof/>
+                <w:webHidden/>
+              </w:rPr>
+            </w:r>
+            <w:r>
+              <w:rPr>
+                <w:noProof/>
+                <w:webHidden/>
+              </w:rPr>
+              <w:fldChar w:fldCharType="separate"/>
+            </w:r>
+            <w:r>
+              <w:rPr>
+                <w:noProof/>
+                <w:webHidden/>
+              </w:rPr>
+              <w:t>13</w:t>
+            </w:r>
+            <w:r>
+              <w:rPr>
+                <w:noProof/>
+                <w:webHidden/>
+              </w:rPr>
+              <w:fldChar w:fldCharType="end"/>
+            </w:r>
+          </w:hyperlink>
+        </w:p>
+        <w:p>
+          <w:pPr>
+            <w:pStyle w:val="ndice1"/>
+            <w:tabs>
+              <w:tab w:val="left" w:pos="660"/>
+              <w:tab w:val="right" w:leader="dot" w:pos="8494"/>
+            </w:tabs>
+            <w:rPr>
+              <w:rFonts w:eastAsiaTheme="minorEastAsia"/>
+              <w:noProof/>
+              <w:lang w:eastAsia="pt-PT"/>
+            </w:rPr>
+          </w:pPr>
+          <w:hyperlink w:anchor="_Toc225346777" w:history="1">
+            <w:r>
+              <w:rPr>
+                <w:rStyle w:val="Hiperligao"/>
+                <w:rFonts w:ascii="Times New Roman" w:hAnsi="Times New Roman" w:cs="Times New Roman"/>
+                <w:b/>
+                <w:noProof/>
+              </w:rPr>
+              <w:t>2.1</w:t>
+            </w:r>
+            <w:r>
+              <w:rPr>
+                <w:rFonts w:eastAsiaTheme="minorEastAsia"/>
+                <w:noProof/>
+                <w:lang w:eastAsia="pt-PT"/>
+              </w:rPr>
+              <w:tab/>
+            </w:r>
+            <w:r>
+              <w:rPr>
+                <w:rStyle w:val="Hiperligao"/>
+                <w:rFonts w:ascii="Times New Roman" w:hAnsi="Times New Roman" w:cs="Times New Roman"/>
+                <w:b/>
+                <w:bCs/>
+                <w:noProof/>
+              </w:rPr>
               <w:t>E</w:t>
             </w:r>
             <w:r>
@@ -1124,7 +1560,7 @@
                 <w:noProof/>
                 <w:webHidden/>
               </w:rPr>
-              <w:instrText xml:space="preserve"> PAGEREF _Toc221641320 \h </w:instrText>
+              <w:instrText xml:space="preserve"> PAGEREF _Toc225346777 \h </w:instrText>
             </w:r>
             <w:r>
               <w:rPr>
@@ -1144,7 +1580,7 @@
                 <w:noProof/>
                 <w:webHidden/>
               </w:rPr>
-              <w:t>14</w:t>
+              <w:t>16</w:t>
             </w:r>
             <w:r>
               <w:rPr>
@@ -1167,13 +1603,13 @@
               <w:lang w:eastAsia="pt-PT"/>
             </w:rPr>
           </w:pPr>
-          <w:hyperlink w:anchor="_Toc221641321" w:history="1">
+          <w:hyperlink w:anchor="_Toc225346778" w:history="1">
             <w:r>
               <w:rPr>
                 <w:rStyle w:val="Hiperligao"/>
                 <w:noProof/>
               </w:rPr>
-              <w:t>Elementos a envolver na PAP</w:t>
+              <w:t>2.2 Elementos a envolver na PAP</w:t>
             </w:r>
             <w:r>
               <w:rPr>
@@ -1194,7 +1630,7 @@
                 <w:noProof/>
                 <w:webHidden/>
               </w:rPr>
-              <w:instrText xml:space="preserve"> PAGEREF _Toc221641321 \h </w:instrText>
+              <w:instrText xml:space="preserve"> PAGEREF _Toc225346778 \h </w:instrText>
             </w:r>
             <w:r>
               <w:rPr>
@@ -1214,7 +1650,7 @@
                 <w:noProof/>
                 <w:webHidden/>
               </w:rPr>
-              <w:t>15</w:t>
+              <w:t>17</w:t>
             </w:r>
             <w:r>
               <w:rPr>
@@ -1237,13 +1673,13 @@
               <w:lang w:eastAsia="pt-PT"/>
             </w:rPr>
           </w:pPr>
-          <w:hyperlink w:anchor="_Toc221641322" w:history="1">
+          <w:hyperlink w:anchor="_Toc225346779" w:history="1">
             <w:r>
               <w:rPr>
                 <w:rStyle w:val="Hiperligao"/>
                 <w:noProof/>
               </w:rPr>
-              <w:t>Concretização do Projeto</w:t>
+              <w:t>3.Concretização do Projeto</w:t>
             </w:r>
             <w:r>
               <w:rPr>
@@ -1264,7 +1700,7 @@
                 <w:noProof/>
                 <w:webHidden/>
               </w:rPr>
-              <w:instrText xml:space="preserve"> PAGEREF _Toc221641322 \h </w:instrText>
+              <w:instrText xml:space="preserve"> PAGEREF _Toc225346779 \h </w:instrText>
             </w:r>
             <w:r>
               <w:rPr>
@@ -1284,7 +1720,7 @@
                 <w:noProof/>
                 <w:webHidden/>
               </w:rPr>
-              <w:t>16</w:t>
+              <w:t>18</w:t>
             </w:r>
             <w:r>
               <w:rPr>
@@ -1307,13 +1743,13 @@
               <w:lang w:eastAsia="pt-PT"/>
             </w:rPr>
           </w:pPr>
-          <w:hyperlink w:anchor="_Toc221641323" w:history="1">
+          <w:hyperlink w:anchor="_Toc225346780" w:history="1">
             <w:r>
               <w:rPr>
                 <w:rStyle w:val="Hiperligao"/>
                 <w:noProof/>
               </w:rPr>
-              <w:t>Identificação do projeto</w:t>
+              <w:t>3.1 Identificação do projeto</w:t>
             </w:r>
             <w:r>
               <w:rPr>
@@ -1334,7 +1770,7 @@
                 <w:noProof/>
                 <w:webHidden/>
               </w:rPr>
-              <w:instrText xml:space="preserve"> PAGEREF _Toc221641323 \h </w:instrText>
+              <w:instrText xml:space="preserve"> PAGEREF _Toc225346780 \h </w:instrText>
             </w:r>
             <w:r>
               <w:rPr>
@@ -1354,7 +1790,7 @@
                 <w:noProof/>
                 <w:webHidden/>
               </w:rPr>
-              <w:t>17</w:t>
+              <w:t>19</w:t>
             </w:r>
             <w:r>
               <w:rPr>
@@ -1377,13 +1813,13 @@
               <w:lang w:eastAsia="pt-PT"/>
             </w:rPr>
           </w:pPr>
-          <w:hyperlink w:anchor="_Toc221641324" w:history="1">
+          <w:hyperlink w:anchor="_Toc225346781" w:history="1">
             <w:r>
               <w:rPr>
                 <w:rStyle w:val="Hiperligao"/>
                 <w:noProof/>
               </w:rPr>
-              <w:t>Fundamentação da escolha do projeto</w:t>
+              <w:t>3.2 Fundamentação da escolha do projeto</w:t>
             </w:r>
             <w:r>
               <w:rPr>
@@ -1404,7 +1840,7 @@
                 <w:noProof/>
                 <w:webHidden/>
               </w:rPr>
-              <w:instrText xml:space="preserve"> PAGEREF _Toc221641324 \h </w:instrText>
+              <w:instrText xml:space="preserve"> PAGEREF _Toc225346781 \h </w:instrText>
             </w:r>
             <w:r>
               <w:rPr>
@@ -1424,7 +1860,243 @@
                 <w:noProof/>
                 <w:webHidden/>
               </w:rPr>
-              <w:t>18</w:t>
+              <w:t>20</w:t>
+            </w:r>
+            <w:r>
+              <w:rPr>
+                <w:noProof/>
+                <w:webHidden/>
+              </w:rPr>
+              <w:fldChar w:fldCharType="end"/>
+            </w:r>
+          </w:hyperlink>
+        </w:p>
+        <w:p>
+          <w:pPr>
+            <w:pStyle w:val="ndice1"/>
+            <w:tabs>
+              <w:tab w:val="left" w:pos="440"/>
+              <w:tab w:val="right" w:leader="dot" w:pos="8494"/>
+            </w:tabs>
+            <w:rPr>
+              <w:rFonts w:eastAsiaTheme="minorEastAsia"/>
+              <w:noProof/>
+              <w:lang w:eastAsia="pt-PT"/>
+            </w:rPr>
+          </w:pPr>
+          <w:hyperlink w:anchor="_Toc225346782" w:history="1">
+            <w:r>
+              <w:rPr>
+                <w:rStyle w:val="Hiperligao"/>
+                <w:rFonts w:ascii="Times New Roman" w:eastAsia="Times New Roman" w:hAnsi="Times New Roman" w:cs="Times New Roman"/>
+                <w:b/>
+                <w:bCs/>
+                <w:noProof/>
+                <w:kern w:val="36"/>
+                <w:lang w:eastAsia="pt-PT"/>
+              </w:rPr>
+              <w:t>4.</w:t>
+            </w:r>
+            <w:r>
+              <w:rPr>
+                <w:rFonts w:eastAsiaTheme="minorEastAsia"/>
+                <w:noProof/>
+                <w:lang w:eastAsia="pt-PT"/>
+              </w:rPr>
+              <w:tab/>
+            </w:r>
+            <w:r>
+              <w:rPr>
+                <w:rStyle w:val="Hiperligao"/>
+                <w:rFonts w:ascii="Times New Roman" w:eastAsia="Times New Roman" w:hAnsi="Times New Roman" w:cs="Times New Roman"/>
+                <w:b/>
+                <w:bCs/>
+                <w:noProof/>
+                <w:kern w:val="36"/>
+                <w:lang w:eastAsia="pt-PT"/>
+              </w:rPr>
+              <w:t>Objetivos</w:t>
+            </w:r>
+            <w:r>
+              <w:rPr>
+                <w:noProof/>
+                <w:webHidden/>
+              </w:rPr>
+              <w:tab/>
+            </w:r>
+            <w:r>
+              <w:rPr>
+                <w:noProof/>
+                <w:webHidden/>
+              </w:rPr>
+              <w:fldChar w:fldCharType="begin"/>
+            </w:r>
+            <w:r>
+              <w:rPr>
+                <w:noProof/>
+                <w:webHidden/>
+              </w:rPr>
+              <w:instrText xml:space="preserve"> PAGEREF _Toc225346782 \h </w:instrText>
+            </w:r>
+            <w:r>
+              <w:rPr>
+                <w:noProof/>
+                <w:webHidden/>
+              </w:rPr>
+            </w:r>
+            <w:r>
+              <w:rPr>
+                <w:noProof/>
+                <w:webHidden/>
+              </w:rPr>
+              <w:fldChar w:fldCharType="separate"/>
+            </w:r>
+            <w:r>
+              <w:rPr>
+                <w:noProof/>
+                <w:webHidden/>
+              </w:rPr>
+              <w:t>22</w:t>
+            </w:r>
+            <w:r>
+              <w:rPr>
+                <w:noProof/>
+                <w:webHidden/>
+              </w:rPr>
+              <w:fldChar w:fldCharType="end"/>
+            </w:r>
+          </w:hyperlink>
+        </w:p>
+        <w:p>
+          <w:pPr>
+            <w:pStyle w:val="ndice2"/>
+            <w:tabs>
+              <w:tab w:val="right" w:leader="dot" w:pos="8494"/>
+            </w:tabs>
+            <w:rPr>
+              <w:rFonts w:eastAsiaTheme="minorEastAsia"/>
+              <w:noProof/>
+              <w:lang w:eastAsia="pt-PT"/>
+            </w:rPr>
+          </w:pPr>
+          <w:hyperlink w:anchor="_Toc225346783" w:history="1">
+            <w:r>
+              <w:rPr>
+                <w:rStyle w:val="Hiperligao"/>
+                <w:noProof/>
+              </w:rPr>
+              <w:t>4.1Objetivos principais</w:t>
+            </w:r>
+            <w:r>
+              <w:rPr>
+                <w:noProof/>
+                <w:webHidden/>
+              </w:rPr>
+              <w:tab/>
+            </w:r>
+            <w:r>
+              <w:rPr>
+                <w:noProof/>
+                <w:webHidden/>
+              </w:rPr>
+              <w:fldChar w:fldCharType="begin"/>
+            </w:r>
+            <w:r>
+              <w:rPr>
+                <w:noProof/>
+                <w:webHidden/>
+              </w:rPr>
+              <w:instrText xml:space="preserve"> PAGEREF _Toc225346783 \h </w:instrText>
+            </w:r>
+            <w:r>
+              <w:rPr>
+                <w:noProof/>
+                <w:webHidden/>
+              </w:rPr>
+            </w:r>
+            <w:r>
+              <w:rPr>
+                <w:noProof/>
+                <w:webHidden/>
+              </w:rPr>
+              <w:fldChar w:fldCharType="separate"/>
+            </w:r>
+            <w:r>
+              <w:rPr>
+                <w:noProof/>
+                <w:webHidden/>
+              </w:rPr>
+              <w:t>22</w:t>
+            </w:r>
+            <w:r>
+              <w:rPr>
+                <w:noProof/>
+                <w:webHidden/>
+              </w:rPr>
+              <w:fldChar w:fldCharType="end"/>
+            </w:r>
+          </w:hyperlink>
+        </w:p>
+        <w:p>
+          <w:pPr>
+            <w:pStyle w:val="ndice2"/>
+            <w:tabs>
+              <w:tab w:val="right" w:leader="dot" w:pos="8494"/>
+            </w:tabs>
+            <w:rPr>
+              <w:rFonts w:eastAsiaTheme="minorEastAsia"/>
+              <w:noProof/>
+              <w:lang w:eastAsia="pt-PT"/>
+            </w:rPr>
+          </w:pPr>
+          <w:hyperlink w:anchor="_Toc225346784" w:history="1">
+            <w:r>
+              <w:rPr>
+                <w:rStyle w:val="Hiperligao"/>
+                <w:noProof/>
+              </w:rPr>
+              <w:t>4.2 Objetivos específicos</w:t>
+            </w:r>
+            <w:r>
+              <w:rPr>
+                <w:noProof/>
+                <w:webHidden/>
+              </w:rPr>
+              <w:tab/>
+            </w:r>
+            <w:r>
+              <w:rPr>
+                <w:noProof/>
+                <w:webHidden/>
+              </w:rPr>
+              <w:fldChar w:fldCharType="begin"/>
+            </w:r>
+            <w:r>
+              <w:rPr>
+                <w:noProof/>
+                <w:webHidden/>
+              </w:rPr>
+              <w:instrText xml:space="preserve"> PAGEREF _Toc225346784 \h </w:instrText>
+            </w:r>
+            <w:r>
+              <w:rPr>
+                <w:noProof/>
+                <w:webHidden/>
+              </w:rPr>
+            </w:r>
+            <w:r>
+              <w:rPr>
+                <w:noProof/>
+                <w:webHidden/>
+              </w:rPr>
+              <w:fldChar w:fldCharType="separate"/>
+            </w:r>
+            <w:r>
+              <w:rPr>
+                <w:noProof/>
+                <w:webHidden/>
+              </w:rPr>
+              <w:t>22</w:t>
             </w:r>
             <w:r>
               <w:rPr>
@@ -1447,7 +2119,7 @@
               <w:lang w:eastAsia="pt-PT"/>
             </w:rPr>
           </w:pPr>
-          <w:hyperlink w:anchor="_Toc221641325" w:history="1">
+          <w:hyperlink w:anchor="_Toc225346785" w:history="1">
             <w:r>
               <w:rPr>
                 <w:rStyle w:val="Hiperligao"/>
@@ -1458,7 +2130,7 @@
                 <w:kern w:val="36"/>
                 <w:lang w:eastAsia="pt-PT"/>
               </w:rPr>
-              <w:t>Objetivos</w:t>
+              <w:t>5.Ferramentas utilizadas</w:t>
             </w:r>
             <w:r>
               <w:rPr>
@@ -1479,7 +2151,7 @@
                 <w:noProof/>
                 <w:webHidden/>
               </w:rPr>
-              <w:instrText xml:space="preserve"> PAGEREF _Toc221641325 \h </w:instrText>
+              <w:instrText xml:space="preserve"> PAGEREF _Toc225346785 \h </w:instrText>
             </w:r>
             <w:r>
               <w:rPr>
@@ -1499,7 +2171,229 @@
                 <w:noProof/>
                 <w:webHidden/>
               </w:rPr>
-              <w:t>20</w:t>
+              <w:t>23</w:t>
+            </w:r>
+            <w:r>
+              <w:rPr>
+                <w:noProof/>
+                <w:webHidden/>
+              </w:rPr>
+              <w:fldChar w:fldCharType="end"/>
+            </w:r>
+          </w:hyperlink>
+        </w:p>
+        <w:p>
+          <w:pPr>
+            <w:pStyle w:val="ndice2"/>
+            <w:tabs>
+              <w:tab w:val="right" w:leader="dot" w:pos="8494"/>
+            </w:tabs>
+            <w:rPr>
+              <w:rFonts w:eastAsiaTheme="minorEastAsia"/>
+              <w:noProof/>
+              <w:lang w:eastAsia="pt-PT"/>
+            </w:rPr>
+          </w:pPr>
+          <w:hyperlink w:anchor="_Toc225346786" w:history="1">
+            <w:r>
+              <w:rPr>
+                <w:rStyle w:val="Hiperligao"/>
+                <w:rFonts w:ascii="Times New Roman" w:eastAsia="Times New Roman" w:hAnsi="Times New Roman" w:cs="Times New Roman"/>
+                <w:b/>
+                <w:bCs/>
+                <w:noProof/>
+                <w:lang w:eastAsia="pt-PT"/>
+              </w:rPr>
+              <w:t>5.1.Hardware</w:t>
+            </w:r>
+            <w:r>
+              <w:rPr>
+                <w:noProof/>
+                <w:webHidden/>
+              </w:rPr>
+              <w:tab/>
+            </w:r>
+            <w:r>
+              <w:rPr>
+                <w:noProof/>
+                <w:webHidden/>
+              </w:rPr>
+              <w:fldChar w:fldCharType="begin"/>
+            </w:r>
+            <w:r>
+              <w:rPr>
+                <w:noProof/>
+                <w:webHidden/>
+              </w:rPr>
+              <w:instrText xml:space="preserve"> PAGEREF _Toc225346786 \h </w:instrText>
+            </w:r>
+            <w:r>
+              <w:rPr>
+                <w:noProof/>
+                <w:webHidden/>
+              </w:rPr>
+            </w:r>
+            <w:r>
+              <w:rPr>
+                <w:noProof/>
+                <w:webHidden/>
+              </w:rPr>
+              <w:fldChar w:fldCharType="separate"/>
+            </w:r>
+            <w:r>
+              <w:rPr>
+                <w:noProof/>
+                <w:webHidden/>
+              </w:rPr>
+              <w:t>23</w:t>
+            </w:r>
+            <w:r>
+              <w:rPr>
+                <w:noProof/>
+                <w:webHidden/>
+              </w:rPr>
+              <w:fldChar w:fldCharType="end"/>
+            </w:r>
+          </w:hyperlink>
+        </w:p>
+        <w:p>
+          <w:pPr>
+            <w:pStyle w:val="ndice2"/>
+            <w:tabs>
+              <w:tab w:val="right" w:leader="dot" w:pos="8494"/>
+            </w:tabs>
+            <w:rPr>
+              <w:rFonts w:eastAsiaTheme="minorEastAsia"/>
+              <w:noProof/>
+              <w:lang w:eastAsia="pt-PT"/>
+            </w:rPr>
+          </w:pPr>
+          <w:hyperlink w:anchor="_Toc225346787" w:history="1">
+            <w:r>
+              <w:rPr>
+                <w:rStyle w:val="Hiperligao"/>
+                <w:rFonts w:ascii="Times New Roman" w:eastAsia="Times New Roman" w:hAnsi="Times New Roman" w:cs="Times New Roman"/>
+                <w:b/>
+                <w:bCs/>
+                <w:noProof/>
+                <w:lang w:eastAsia="pt-PT"/>
+              </w:rPr>
+              <w:t>5.2.Software</w:t>
+            </w:r>
+            <w:r>
+              <w:rPr>
+                <w:noProof/>
+                <w:webHidden/>
+              </w:rPr>
+              <w:tab/>
+            </w:r>
+            <w:r>
+              <w:rPr>
+                <w:noProof/>
+                <w:webHidden/>
+              </w:rPr>
+              <w:fldChar w:fldCharType="begin"/>
+            </w:r>
+            <w:r>
+              <w:rPr>
+                <w:noProof/>
+                <w:webHidden/>
+              </w:rPr>
+              <w:instrText xml:space="preserve"> PAGEREF _Toc225346787 \h </w:instrText>
+            </w:r>
+            <w:r>
+              <w:rPr>
+                <w:noProof/>
+                <w:webHidden/>
+              </w:rPr>
+            </w:r>
+            <w:r>
+              <w:rPr>
+                <w:noProof/>
+                <w:webHidden/>
+              </w:rPr>
+              <w:fldChar w:fldCharType="separate"/>
+            </w:r>
+            <w:r>
+              <w:rPr>
+                <w:noProof/>
+                <w:webHidden/>
+              </w:rPr>
+              <w:t>23</w:t>
+            </w:r>
+            <w:r>
+              <w:rPr>
+                <w:noProof/>
+                <w:webHidden/>
+              </w:rPr>
+              <w:fldChar w:fldCharType="end"/>
+            </w:r>
+          </w:hyperlink>
+        </w:p>
+        <w:p>
+          <w:pPr>
+            <w:pStyle w:val="ndice2"/>
+            <w:tabs>
+              <w:tab w:val="right" w:leader="dot" w:pos="8494"/>
+            </w:tabs>
+            <w:rPr>
+              <w:rFonts w:eastAsiaTheme="minorEastAsia"/>
+              <w:noProof/>
+              <w:lang w:eastAsia="pt-PT"/>
+            </w:rPr>
+          </w:pPr>
+          <w:hyperlink w:anchor="_Toc225346788" w:history="1">
+            <w:r>
+              <w:rPr>
+                <w:rStyle w:val="Hiperligao"/>
+                <w:rFonts w:ascii="Times New Roman" w:eastAsia="Times New Roman" w:hAnsi="Times New Roman" w:cs="Times New Roman"/>
+                <w:b/>
+                <w:bCs/>
+                <w:noProof/>
+                <w:lang w:eastAsia="pt-PT"/>
+              </w:rPr>
+              <w:t>5.3 Recursos Online e Ferramentas de Referência</w:t>
+            </w:r>
+            <w:r>
+              <w:rPr>
+                <w:noProof/>
+                <w:webHidden/>
+              </w:rPr>
+              <w:tab/>
+            </w:r>
+            <w:r>
+              <w:rPr>
+                <w:noProof/>
+                <w:webHidden/>
+              </w:rPr>
+              <w:fldChar w:fldCharType="begin"/>
+            </w:r>
+            <w:r>
+              <w:rPr>
+                <w:noProof/>
+                <w:webHidden/>
+              </w:rPr>
+              <w:instrText xml:space="preserve"> PAGEREF _Toc225346788 \h </w:instrText>
+            </w:r>
+            <w:r>
+              <w:rPr>
+                <w:noProof/>
+                <w:webHidden/>
+              </w:rPr>
+            </w:r>
+            <w:r>
+              <w:rPr>
+                <w:noProof/>
+                <w:webHidden/>
+              </w:rPr>
+              <w:fldChar w:fldCharType="separate"/>
+            </w:r>
+            <w:r>
+              <w:rPr>
+                <w:noProof/>
+                <w:webHidden/>
+              </w:rPr>
+              <w:t>23</w:t>
             </w:r>
             <w:r>
               <w:rPr>
@@ -1522,7 +2416,7 @@
               <w:lang w:eastAsia="pt-PT"/>
             </w:rPr>
           </w:pPr>
-          <w:hyperlink w:anchor="_Toc221641326" w:history="1">
+          <w:hyperlink w:anchor="_Toc225346789" w:history="1">
             <w:r>
               <w:rPr>
                 <w:rStyle w:val="Hiperligao"/>
@@ -1533,7 +2427,7 @@
                 <w:kern w:val="36"/>
                 <w:lang w:eastAsia="pt-PT"/>
               </w:rPr>
-              <w:t>Ferramentas utilizadas</w:t>
+              <w:t>6.1.Justificação da Ferramenta  Godot</w:t>
             </w:r>
             <w:r>
               <w:rPr>
@@ -1554,7 +2448,7 @@
                 <w:noProof/>
                 <w:webHidden/>
               </w:rPr>
-              <w:instrText xml:space="preserve"> PAGEREF _Toc221641326 \h </w:instrText>
+              <w:instrText xml:space="preserve"> PAGEREF _Toc225346789 \h </w:instrText>
             </w:r>
             <w:r>
               <w:rPr>
@@ -1574,7 +2468,93 @@
                 <w:noProof/>
                 <w:webHidden/>
               </w:rPr>
-              <w:t>21</w:t>
+              <w:t>24</w:t>
+            </w:r>
+            <w:r>
+              <w:rPr>
+                <w:noProof/>
+                <w:webHidden/>
+              </w:rPr>
+              <w:fldChar w:fldCharType="end"/>
+            </w:r>
+          </w:hyperlink>
+        </w:p>
+        <w:p>
+          <w:pPr>
+            <w:pStyle w:val="ndice1"/>
+            <w:tabs>
+              <w:tab w:val="left" w:pos="440"/>
+              <w:tab w:val="right" w:leader="dot" w:pos="8494"/>
+            </w:tabs>
+            <w:rPr>
+              <w:rFonts w:eastAsiaTheme="minorEastAsia"/>
+              <w:noProof/>
+              <w:lang w:eastAsia="pt-PT"/>
+            </w:rPr>
+          </w:pPr>
+          <w:hyperlink w:anchor="_Toc225346790" w:history="1">
+            <w:r>
+              <w:rPr>
+                <w:rStyle w:val="Hiperligao"/>
+                <w:noProof/>
+              </w:rPr>
+              <w:t>7.</w:t>
+            </w:r>
+            <w:r>
+              <w:rPr>
+                <w:rFonts w:eastAsiaTheme="minorEastAsia"/>
+                <w:noProof/>
+                <w:lang w:eastAsia="pt-PT"/>
+              </w:rPr>
+              <w:tab/>
+            </w:r>
+            <w:r>
+              <w:rPr>
+                <w:rStyle w:val="Hiperligao"/>
+                <w:noProof/>
+              </w:rPr>
+              <w:t>Análise e Planeamento do Projeto</w:t>
+            </w:r>
+            <w:r>
+              <w:rPr>
+                <w:noProof/>
+                <w:webHidden/>
+              </w:rPr>
+              <w:tab/>
+            </w:r>
+            <w:r>
+              <w:rPr>
+                <w:noProof/>
+                <w:webHidden/>
+              </w:rPr>
+              <w:fldChar w:fldCharType="begin"/>
+            </w:r>
+            <w:r>
+              <w:rPr>
+                <w:noProof/>
+                <w:webHidden/>
+              </w:rPr>
+              <w:instrText xml:space="preserve"> PAGEREF _Toc225346790 \h </w:instrText>
+            </w:r>
+            <w:r>
+              <w:rPr>
+                <w:noProof/>
+                <w:webHidden/>
+              </w:rPr>
+            </w:r>
+            <w:r>
+              <w:rPr>
+                <w:noProof/>
+                <w:webHidden/>
+              </w:rPr>
+              <w:fldChar w:fldCharType="separate"/>
+            </w:r>
+            <w:r>
+              <w:rPr>
+                <w:noProof/>
+                <w:webHidden/>
+              </w:rPr>
+              <w:t>25</w:t>
             </w:r>
             <w:r>
               <w:rPr>
@@ -1597,17 +2577,13 @@
               <w:lang w:eastAsia="pt-PT"/>
             </w:rPr>
           </w:pPr>
-          <w:hyperlink w:anchor="_Toc221641327" w:history="1">
+          <w:hyperlink w:anchor="_Toc225346791" w:history="1">
             <w:r>
               <w:rPr>
                 <w:rStyle w:val="Hiperligao"/>
-                <w:rFonts w:ascii="Times New Roman" w:eastAsia="Times New Roman" w:hAnsi="Times New Roman" w:cs="Times New Roman"/>
-                <w:b/>
-                <w:bCs/>
-                <w:noProof/>
-                <w:lang w:eastAsia="pt-PT"/>
-              </w:rPr>
-              <w:t>Hardware</w:t>
+                <w:noProof/>
+              </w:rPr>
+              <w:t>7.1 Público-alvo</w:t>
             </w:r>
             <w:r>
               <w:rPr>
@@ -1628,7 +2604,7 @@
                 <w:noProof/>
                 <w:webHidden/>
               </w:rPr>
-              <w:instrText xml:space="preserve"> PAGEREF _Toc221641327 \h </w:instrText>
+              <w:instrText xml:space="preserve"> PAGEREF _Toc225346791 \h </w:instrText>
             </w:r>
             <w:r>
               <w:rPr>
@@ -1648,7 +2624,7 @@
                 <w:noProof/>
                 <w:webHidden/>
               </w:rPr>
-              <w:t>21</w:t>
+              <w:t>25</w:t>
             </w:r>
             <w:r>
               <w:rPr>
@@ -1671,17 +2647,13 @@
               <w:lang w:eastAsia="pt-PT"/>
             </w:rPr>
           </w:pPr>
-          <w:hyperlink w:anchor="_Toc221641328" w:history="1">
+          <w:hyperlink w:anchor="_Toc225346792" w:history="1">
             <w:r>
               <w:rPr>
                 <w:rStyle w:val="Hiperligao"/>
-                <w:rFonts w:ascii="Times New Roman" w:eastAsia="Times New Roman" w:hAnsi="Times New Roman" w:cs="Times New Roman"/>
-                <w:b/>
-                <w:bCs/>
-                <w:noProof/>
-                <w:lang w:eastAsia="pt-PT"/>
-              </w:rPr>
-              <w:t>Software</w:t>
+                <w:noProof/>
+              </w:rPr>
+              <w:t>7.2 Género e Mecânicas Principais</w:t>
             </w:r>
             <w:r>
               <w:rPr>
@@ -1702,7 +2674,7 @@
                 <w:noProof/>
                 <w:webHidden/>
               </w:rPr>
-              <w:instrText xml:space="preserve"> PAGEREF _Toc221641328 \h </w:instrText>
+              <w:instrText xml:space="preserve"> PAGEREF _Toc225346792 \h </w:instrText>
             </w:r>
             <w:r>
               <w:rPr>
@@ -1722,7 +2694,7 @@
                 <w:noProof/>
                 <w:webHidden/>
               </w:rPr>
-              <w:t>21</w:t>
+              <w:t>26</w:t>
             </w:r>
             <w:r>
               <w:rPr>
@@ -1745,17 +2717,13 @@
               <w:lang w:eastAsia="pt-PT"/>
             </w:rPr>
           </w:pPr>
-          <w:hyperlink w:anchor="_Toc221641329" w:history="1">
+          <w:hyperlink w:anchor="_Toc225346793" w:history="1">
             <w:r>
               <w:rPr>
                 <w:rStyle w:val="Hiperligao"/>
-                <w:rFonts w:ascii="Times New Roman" w:eastAsia="Times New Roman" w:hAnsi="Times New Roman" w:cs="Times New Roman"/>
-                <w:b/>
-                <w:bCs/>
-                <w:noProof/>
-                <w:lang w:eastAsia="pt-PT"/>
-              </w:rPr>
-              <w:t>Recursos Online e Ferramentas de Referência</w:t>
+                <w:noProof/>
+              </w:rPr>
+              <w:t>7.3 Estrutura Geral do Jogo</w:t>
             </w:r>
             <w:r>
               <w:rPr>
@@ -1776,7 +2744,7 @@
                 <w:noProof/>
                 <w:webHidden/>
               </w:rPr>
-              <w:instrText xml:space="preserve"> PAGEREF _Toc221641329 \h </w:instrText>
+              <w:instrText xml:space="preserve"> PAGEREF _Toc225346793 \h </w:instrText>
             </w:r>
             <w:r>
               <w:rPr>
@@ -1796,7 +2764,147 @@
                 <w:noProof/>
                 <w:webHidden/>
               </w:rPr>
-              <w:t>21</w:t>
+              <w:t>27</w:t>
+            </w:r>
+            <w:r>
+              <w:rPr>
+                <w:noProof/>
+                <w:webHidden/>
+              </w:rPr>
+              <w:fldChar w:fldCharType="end"/>
+            </w:r>
+          </w:hyperlink>
+        </w:p>
+        <w:p>
+          <w:pPr>
+            <w:pStyle w:val="ndice2"/>
+            <w:tabs>
+              <w:tab w:val="right" w:leader="dot" w:pos="8494"/>
+            </w:tabs>
+            <w:rPr>
+              <w:rFonts w:eastAsiaTheme="minorEastAsia"/>
+              <w:noProof/>
+              <w:lang w:eastAsia="pt-PT"/>
+            </w:rPr>
+          </w:pPr>
+          <w:hyperlink w:anchor="_Toc225346794" w:history="1">
+            <w:r>
+              <w:rPr>
+                <w:rStyle w:val="Hiperligao"/>
+                <w:noProof/>
+              </w:rPr>
+              <w:t>7.4 Organização das Cenas</w:t>
+            </w:r>
+            <w:r>
+              <w:rPr>
+                <w:noProof/>
+                <w:webHidden/>
+              </w:rPr>
+              <w:tab/>
+            </w:r>
+            <w:r>
+              <w:rPr>
+                <w:noProof/>
+                <w:webHidden/>
+              </w:rPr>
+              <w:fldChar w:fldCharType="begin"/>
+            </w:r>
+            <w:r>
+              <w:rPr>
+                <w:noProof/>
+                <w:webHidden/>
+              </w:rPr>
+              <w:instrText xml:space="preserve"> PAGEREF _Toc225346794 \h </w:instrText>
+            </w:r>
+            <w:r>
+              <w:rPr>
+                <w:noProof/>
+                <w:webHidden/>
+              </w:rPr>
+            </w:r>
+            <w:r>
+              <w:rPr>
+                <w:noProof/>
+                <w:webHidden/>
+              </w:rPr>
+              <w:fldChar w:fldCharType="separate"/>
+            </w:r>
+            <w:r>
+              <w:rPr>
+                <w:noProof/>
+                <w:webHidden/>
+              </w:rPr>
+              <w:t>28</w:t>
+            </w:r>
+            <w:r>
+              <w:rPr>
+                <w:noProof/>
+                <w:webHidden/>
+              </w:rPr>
+              <w:fldChar w:fldCharType="end"/>
+            </w:r>
+          </w:hyperlink>
+        </w:p>
+        <w:p>
+          <w:pPr>
+            <w:pStyle w:val="ndice2"/>
+            <w:tabs>
+              <w:tab w:val="right" w:leader="dot" w:pos="8494"/>
+            </w:tabs>
+            <w:rPr>
+              <w:rFonts w:eastAsiaTheme="minorEastAsia"/>
+              <w:noProof/>
+              <w:lang w:eastAsia="pt-PT"/>
+            </w:rPr>
+          </w:pPr>
+          <w:hyperlink w:anchor="_Toc225346795" w:history="1">
+            <w:r>
+              <w:rPr>
+                <w:rStyle w:val="Hiperligao"/>
+                <w:noProof/>
+              </w:rPr>
+              <w:t>7.5 Planeamento das Funcionalidades</w:t>
+            </w:r>
+            <w:r>
+              <w:rPr>
+                <w:noProof/>
+                <w:webHidden/>
+              </w:rPr>
+              <w:tab/>
+            </w:r>
+            <w:r>
+              <w:rPr>
+                <w:noProof/>
+                <w:webHidden/>
+              </w:rPr>
+              <w:fldChar w:fldCharType="begin"/>
+            </w:r>
+            <w:r>
+              <w:rPr>
+                <w:noProof/>
+                <w:webHidden/>
+              </w:rPr>
+              <w:instrText xml:space="preserve"> PAGEREF _Toc225346795 \h </w:instrText>
+            </w:r>
+            <w:r>
+              <w:rPr>
+                <w:noProof/>
+                <w:webHidden/>
+              </w:rPr>
+            </w:r>
+            <w:r>
+              <w:rPr>
+                <w:noProof/>
+                <w:webHidden/>
+              </w:rPr>
+              <w:fldChar w:fldCharType="separate"/>
+            </w:r>
+            <w:r>
+              <w:rPr>
+                <w:noProof/>
+                <w:webHidden/>
+              </w:rPr>
+              <w:t>28</w:t>
             </w:r>
             <w:r>
               <w:rPr>
@@ -1819,18 +2927,13 @@
               <w:lang w:eastAsia="pt-PT"/>
             </w:rPr>
           </w:pPr>
-          <w:hyperlink w:anchor="_Toc221641330" w:history="1">
+          <w:hyperlink w:anchor="_Toc225346796" w:history="1">
             <w:r>
               <w:rPr>
                 <w:rStyle w:val="Hiperligao"/>
-                <w:rFonts w:ascii="Times New Roman" w:eastAsia="Times New Roman" w:hAnsi="Times New Roman" w:cs="Times New Roman"/>
-                <w:b/>
-                <w:bCs/>
-                <w:noProof/>
-                <w:kern w:val="36"/>
-                <w:lang w:eastAsia="pt-PT"/>
-              </w:rPr>
-              <w:t>Fundamentação do Tema</w:t>
+                <w:noProof/>
+              </w:rPr>
+              <w:t>8. Arquitetura Técnica do Jogo</w:t>
             </w:r>
             <w:r>
               <w:rPr>
@@ -1851,7 +2954,7 @@
                 <w:noProof/>
                 <w:webHidden/>
               </w:rPr>
-              <w:instrText xml:space="preserve"> PAGEREF _Toc221641330 \h </w:instrText>
+              <w:instrText xml:space="preserve"> PAGEREF _Toc225346796 \h </w:instrText>
             </w:r>
             <w:r>
               <w:rPr>
@@ -1871,7 +2974,427 @@
                 <w:noProof/>
                 <w:webHidden/>
               </w:rPr>
-              <w:t>22</w:t>
+              <w:t>29</w:t>
+            </w:r>
+            <w:r>
+              <w:rPr>
+                <w:noProof/>
+                <w:webHidden/>
+              </w:rPr>
+              <w:fldChar w:fldCharType="end"/>
+            </w:r>
+          </w:hyperlink>
+        </w:p>
+        <w:p>
+          <w:pPr>
+            <w:pStyle w:val="ndice2"/>
+            <w:tabs>
+              <w:tab w:val="right" w:leader="dot" w:pos="8494"/>
+            </w:tabs>
+            <w:rPr>
+              <w:rFonts w:eastAsiaTheme="minorEastAsia"/>
+              <w:noProof/>
+              <w:lang w:eastAsia="pt-PT"/>
+            </w:rPr>
+          </w:pPr>
+          <w:hyperlink w:anchor="_Toc225346797" w:history="1">
+            <w:r>
+              <w:rPr>
+                <w:rStyle w:val="Hiperligao"/>
+                <w:noProof/>
+              </w:rPr>
+              <w:t>8.1 Organização do Projeto em Godot</w:t>
+            </w:r>
+            <w:r>
+              <w:rPr>
+                <w:noProof/>
+                <w:webHidden/>
+              </w:rPr>
+              <w:tab/>
+            </w:r>
+            <w:r>
+              <w:rPr>
+                <w:noProof/>
+                <w:webHidden/>
+              </w:rPr>
+              <w:fldChar w:fldCharType="begin"/>
+            </w:r>
+            <w:r>
+              <w:rPr>
+                <w:noProof/>
+                <w:webHidden/>
+              </w:rPr>
+              <w:instrText xml:space="preserve"> PAGEREF _Toc225346797 \h </w:instrText>
+            </w:r>
+            <w:r>
+              <w:rPr>
+                <w:noProof/>
+                <w:webHidden/>
+              </w:rPr>
+            </w:r>
+            <w:r>
+              <w:rPr>
+                <w:noProof/>
+                <w:webHidden/>
+              </w:rPr>
+              <w:fldChar w:fldCharType="separate"/>
+            </w:r>
+            <w:r>
+              <w:rPr>
+                <w:noProof/>
+                <w:webHidden/>
+              </w:rPr>
+              <w:t>29</w:t>
+            </w:r>
+            <w:r>
+              <w:rPr>
+                <w:noProof/>
+                <w:webHidden/>
+              </w:rPr>
+              <w:fldChar w:fldCharType="end"/>
+            </w:r>
+          </w:hyperlink>
+        </w:p>
+        <w:p>
+          <w:pPr>
+            <w:pStyle w:val="ndice2"/>
+            <w:tabs>
+              <w:tab w:val="right" w:leader="dot" w:pos="8494"/>
+            </w:tabs>
+            <w:rPr>
+              <w:rFonts w:eastAsiaTheme="minorEastAsia"/>
+              <w:noProof/>
+              <w:lang w:eastAsia="pt-PT"/>
+            </w:rPr>
+          </w:pPr>
+          <w:hyperlink w:anchor="_Toc225346798" w:history="1">
+            <w:r>
+              <w:rPr>
+                <w:rStyle w:val="Hiperligao"/>
+                <w:noProof/>
+              </w:rPr>
+              <w:t>8.2 Sistema de Cenas e Modularidade</w:t>
+            </w:r>
+            <w:r>
+              <w:rPr>
+                <w:noProof/>
+                <w:webHidden/>
+              </w:rPr>
+              <w:tab/>
+            </w:r>
+            <w:r>
+              <w:rPr>
+                <w:noProof/>
+                <w:webHidden/>
+              </w:rPr>
+              <w:fldChar w:fldCharType="begin"/>
+            </w:r>
+            <w:r>
+              <w:rPr>
+                <w:noProof/>
+                <w:webHidden/>
+              </w:rPr>
+              <w:instrText xml:space="preserve"> PAGEREF _Toc225346798 \h </w:instrText>
+            </w:r>
+            <w:r>
+              <w:rPr>
+                <w:noProof/>
+                <w:webHidden/>
+              </w:rPr>
+            </w:r>
+            <w:r>
+              <w:rPr>
+                <w:noProof/>
+                <w:webHidden/>
+              </w:rPr>
+              <w:fldChar w:fldCharType="separate"/>
+            </w:r>
+            <w:r>
+              <w:rPr>
+                <w:noProof/>
+                <w:webHidden/>
+              </w:rPr>
+              <w:t>30</w:t>
+            </w:r>
+            <w:r>
+              <w:rPr>
+                <w:noProof/>
+                <w:webHidden/>
+              </w:rPr>
+              <w:fldChar w:fldCharType="end"/>
+            </w:r>
+          </w:hyperlink>
+        </w:p>
+        <w:p>
+          <w:pPr>
+            <w:pStyle w:val="ndice2"/>
+            <w:tabs>
+              <w:tab w:val="right" w:leader="dot" w:pos="8494"/>
+            </w:tabs>
+            <w:rPr>
+              <w:rFonts w:eastAsiaTheme="minorEastAsia"/>
+              <w:noProof/>
+              <w:lang w:eastAsia="pt-PT"/>
+            </w:rPr>
+          </w:pPr>
+          <w:hyperlink w:anchor="_Toc225346799" w:history="1">
+            <w:r>
+              <w:rPr>
+                <w:rStyle w:val="Hiperligao"/>
+                <w:noProof/>
+              </w:rPr>
+              <w:t>8.3 SceneManager e LevelTransition</w:t>
+            </w:r>
+            <w:r>
+              <w:rPr>
+                <w:noProof/>
+                <w:webHidden/>
+              </w:rPr>
+              <w:tab/>
+            </w:r>
+            <w:r>
+              <w:rPr>
+                <w:noProof/>
+                <w:webHidden/>
+              </w:rPr>
+              <w:fldChar w:fldCharType="begin"/>
+            </w:r>
+            <w:r>
+              <w:rPr>
+                <w:noProof/>
+                <w:webHidden/>
+              </w:rPr>
+              <w:instrText xml:space="preserve"> PAGEREF _Toc225346799 \h </w:instrText>
+            </w:r>
+            <w:r>
+              <w:rPr>
+                <w:noProof/>
+                <w:webHidden/>
+              </w:rPr>
+            </w:r>
+            <w:r>
+              <w:rPr>
+                <w:noProof/>
+                <w:webHidden/>
+              </w:rPr>
+              <w:fldChar w:fldCharType="separate"/>
+            </w:r>
+            <w:r>
+              <w:rPr>
+                <w:noProof/>
+                <w:webHidden/>
+              </w:rPr>
+              <w:t>31</w:t>
+            </w:r>
+            <w:r>
+              <w:rPr>
+                <w:noProof/>
+                <w:webHidden/>
+              </w:rPr>
+              <w:fldChar w:fldCharType="end"/>
+            </w:r>
+          </w:hyperlink>
+        </w:p>
+        <w:p>
+          <w:pPr>
+            <w:pStyle w:val="ndice2"/>
+            <w:tabs>
+              <w:tab w:val="right" w:leader="dot" w:pos="8494"/>
+            </w:tabs>
+            <w:rPr>
+              <w:rFonts w:eastAsiaTheme="minorEastAsia"/>
+              <w:noProof/>
+              <w:lang w:eastAsia="pt-PT"/>
+            </w:rPr>
+          </w:pPr>
+          <w:hyperlink w:anchor="_Toc225346800" w:history="1">
+            <w:r>
+              <w:rPr>
+                <w:rStyle w:val="Hiperligao"/>
+                <w:noProof/>
+              </w:rPr>
+              <w:t>8.4 Máquina de Estados do Jogador</w:t>
+            </w:r>
+            <w:r>
+              <w:rPr>
+                <w:noProof/>
+                <w:webHidden/>
+              </w:rPr>
+              <w:tab/>
+            </w:r>
+            <w:r>
+              <w:rPr>
+                <w:noProof/>
+                <w:webHidden/>
+              </w:rPr>
+              <w:fldChar w:fldCharType="begin"/>
+            </w:r>
+            <w:r>
+              <w:rPr>
+                <w:noProof/>
+                <w:webHidden/>
+              </w:rPr>
+              <w:instrText xml:space="preserve"> PAGEREF _Toc225346800 \h </w:instrText>
+            </w:r>
+            <w:r>
+              <w:rPr>
+                <w:noProof/>
+                <w:webHidden/>
+              </w:rPr>
+            </w:r>
+            <w:r>
+              <w:rPr>
+                <w:noProof/>
+                <w:webHidden/>
+              </w:rPr>
+              <w:fldChar w:fldCharType="separate"/>
+            </w:r>
+            <w:r>
+              <w:rPr>
+                <w:noProof/>
+                <w:webHidden/>
+              </w:rPr>
+              <w:t>32</w:t>
+            </w:r>
+            <w:r>
+              <w:rPr>
+                <w:noProof/>
+                <w:webHidden/>
+              </w:rPr>
+              <w:fldChar w:fldCharType="end"/>
+            </w:r>
+          </w:hyperlink>
+        </w:p>
+        <w:p>
+          <w:pPr>
+            <w:pStyle w:val="ndice2"/>
+            <w:tabs>
+              <w:tab w:val="right" w:leader="dot" w:pos="8494"/>
+            </w:tabs>
+            <w:rPr>
+              <w:rFonts w:eastAsiaTheme="minorEastAsia"/>
+              <w:noProof/>
+              <w:lang w:eastAsia="pt-PT"/>
+            </w:rPr>
+          </w:pPr>
+          <w:hyperlink w:anchor="_Toc225346801" w:history="1">
+            <w:r>
+              <w:rPr>
+                <w:rStyle w:val="Hiperligao"/>
+                <w:noProof/>
+              </w:rPr>
+              <w:t>8.5 Sistema de Animações</w:t>
+            </w:r>
+            <w:r>
+              <w:rPr>
+                <w:noProof/>
+                <w:webHidden/>
+              </w:rPr>
+              <w:tab/>
+            </w:r>
+            <w:r>
+              <w:rPr>
+                <w:noProof/>
+                <w:webHidden/>
+              </w:rPr>
+              <w:fldChar w:fldCharType="begin"/>
+            </w:r>
+            <w:r>
+              <w:rPr>
+                <w:noProof/>
+                <w:webHidden/>
+              </w:rPr>
+              <w:instrText xml:space="preserve"> PAGEREF _Toc225346801 \h </w:instrText>
+            </w:r>
+            <w:r>
+              <w:rPr>
+                <w:noProof/>
+                <w:webHidden/>
+              </w:rPr>
+            </w:r>
+            <w:r>
+              <w:rPr>
+                <w:noProof/>
+                <w:webHidden/>
+              </w:rPr>
+              <w:fldChar w:fldCharType="separate"/>
+            </w:r>
+            <w:r>
+              <w:rPr>
+                <w:noProof/>
+                <w:webHidden/>
+              </w:rPr>
+              <w:t>33</w:t>
+            </w:r>
+            <w:r>
+              <w:rPr>
+                <w:noProof/>
+                <w:webHidden/>
+              </w:rPr>
+              <w:fldChar w:fldCharType="end"/>
+            </w:r>
+          </w:hyperlink>
+        </w:p>
+        <w:p>
+          <w:pPr>
+            <w:pStyle w:val="ndice2"/>
+            <w:tabs>
+              <w:tab w:val="right" w:leader="dot" w:pos="8494"/>
+            </w:tabs>
+            <w:rPr>
+              <w:rFonts w:eastAsiaTheme="minorEastAsia"/>
+              <w:noProof/>
+              <w:lang w:eastAsia="pt-PT"/>
+            </w:rPr>
+          </w:pPr>
+          <w:hyperlink w:anchor="_Toc225346802" w:history="1">
+            <w:r>
+              <w:rPr>
+                <w:rStyle w:val="Hiperligao"/>
+                <w:noProof/>
+              </w:rPr>
+              <w:t>8.6 Sistema de Colisões e Física</w:t>
+            </w:r>
+            <w:r>
+              <w:rPr>
+                <w:noProof/>
+                <w:webHidden/>
+              </w:rPr>
+              <w:tab/>
+            </w:r>
+            <w:r>
+              <w:rPr>
+                <w:noProof/>
+                <w:webHidden/>
+              </w:rPr>
+              <w:fldChar w:fldCharType="begin"/>
+            </w:r>
+            <w:r>
+              <w:rPr>
+                <w:noProof/>
+                <w:webHidden/>
+              </w:rPr>
+              <w:instrText xml:space="preserve"> PAGEREF _Toc225346802 \h </w:instrText>
+            </w:r>
+            <w:r>
+              <w:rPr>
+                <w:noProof/>
+                <w:webHidden/>
+              </w:rPr>
+            </w:r>
+            <w:r>
+              <w:rPr>
+                <w:noProof/>
+                <w:webHidden/>
+              </w:rPr>
+              <w:fldChar w:fldCharType="separate"/>
+            </w:r>
+            <w:r>
+              <w:rPr>
+                <w:noProof/>
+                <w:webHidden/>
+              </w:rPr>
+              <w:t>34</w:t>
             </w:r>
             <w:r>
               <w:rPr>
@@ -1894,18 +3417,13 @@
               <w:lang w:eastAsia="pt-PT"/>
             </w:rPr>
           </w:pPr>
-          <w:hyperlink w:anchor="_Toc221641331" w:history="1">
+          <w:hyperlink w:anchor="_Toc225346803" w:history="1">
             <w:r>
               <w:rPr>
                 <w:rStyle w:val="Hiperligao"/>
-                <w:rFonts w:ascii="Times New Roman" w:eastAsia="Times New Roman" w:hAnsi="Times New Roman" w:cs="Times New Roman"/>
-                <w:b/>
-                <w:bCs/>
-                <w:noProof/>
-                <w:kern w:val="36"/>
-                <w:lang w:eastAsia="pt-PT"/>
-              </w:rPr>
-              <w:t>Justificação da Ferramenta  Godot 4.5</w:t>
+                <w:noProof/>
+              </w:rPr>
+              <w:t>9. Problemas Encontrados e Resolução</w:t>
             </w:r>
             <w:r>
               <w:rPr>
@@ -1926,7 +3444,7 @@
                 <w:noProof/>
                 <w:webHidden/>
               </w:rPr>
-              <w:instrText xml:space="preserve"> PAGEREF _Toc221641331 \h </w:instrText>
+              <w:instrText xml:space="preserve"> PAGEREF _Toc225346803 \h </w:instrText>
             </w:r>
             <w:r>
               <w:rPr>
@@ -1946,77 +3464,7 @@
                 <w:noProof/>
                 <w:webHidden/>
               </w:rPr>
-              <w:t>23</w:t>
-            </w:r>
-            <w:r>
-              <w:rPr>
-                <w:noProof/>
-                <w:webHidden/>
-              </w:rPr>
-              <w:fldChar w:fldCharType="end"/>
-            </w:r>
-          </w:hyperlink>
-        </w:p>
-        <w:p>
-          <w:pPr>
-            <w:pStyle w:val="ndice1"/>
-            <w:tabs>
-              <w:tab w:val="right" w:leader="dot" w:pos="8494"/>
-            </w:tabs>
-            <w:rPr>
-              <w:rFonts w:eastAsiaTheme="minorEastAsia"/>
-              <w:noProof/>
-              <w:lang w:eastAsia="pt-PT"/>
-            </w:rPr>
-          </w:pPr>
-          <w:hyperlink w:anchor="_Toc221641332" w:history="1">
-            <w:r>
-              <w:rPr>
-                <w:rStyle w:val="Hiperligao"/>
-                <w:noProof/>
-              </w:rPr>
-              <w:t>Análise e Planeamento do Projeto</w:t>
-            </w:r>
-            <w:r>
-              <w:rPr>
-                <w:noProof/>
-                <w:webHidden/>
-              </w:rPr>
-              <w:tab/>
-            </w:r>
-            <w:r>
-              <w:rPr>
-                <w:noProof/>
-                <w:webHidden/>
-              </w:rPr>
-              <w:fldChar w:fldCharType="begin"/>
-            </w:r>
-            <w:r>
-              <w:rPr>
-                <w:noProof/>
-                <w:webHidden/>
-              </w:rPr>
-              <w:instrText xml:space="preserve"> PAGEREF _Toc221641332 \h </w:instrText>
-            </w:r>
-            <w:r>
-              <w:rPr>
-                <w:noProof/>
-                <w:webHidden/>
-              </w:rPr>
-            </w:r>
-            <w:r>
-              <w:rPr>
-                <w:noProof/>
-                <w:webHidden/>
-              </w:rPr>
-              <w:fldChar w:fldCharType="separate"/>
-            </w:r>
-            <w:r>
-              <w:rPr>
-                <w:noProof/>
-                <w:webHidden/>
-              </w:rPr>
-              <w:t>24</w:t>
+              <w:t>35</w:t>
             </w:r>
             <w:r>
               <w:rPr>
@@ -2039,13 +3487,13 @@
               <w:lang w:eastAsia="pt-PT"/>
             </w:rPr>
           </w:pPr>
-          <w:hyperlink w:anchor="_Toc221641333" w:history="1">
+          <w:hyperlink w:anchor="_Toc225346804" w:history="1">
             <w:r>
               <w:rPr>
                 <w:rStyle w:val="Hiperligao"/>
                 <w:noProof/>
               </w:rPr>
-              <w:t>Público-alvo</w:t>
+              <w:t>9.1 Problemas com Transições de Níveis</w:t>
             </w:r>
             <w:r>
               <w:rPr>
@@ -2066,7 +3514,7 @@
                 <w:noProof/>
                 <w:webHidden/>
               </w:rPr>
-              <w:instrText xml:space="preserve"> PAGEREF _Toc221641333 \h </w:instrText>
+              <w:instrText xml:space="preserve"> PAGEREF _Toc225346804 \h </w:instrText>
             </w:r>
             <w:r>
               <w:rPr>
@@ -2086,7 +3534,7 @@
                 <w:noProof/>
                 <w:webHidden/>
               </w:rPr>
-              <w:t>24</w:t>
+              <w:t>35</w:t>
             </w:r>
             <w:r>
               <w:rPr>
@@ -2109,13 +3557,13 @@
               <w:lang w:eastAsia="pt-PT"/>
             </w:rPr>
           </w:pPr>
-          <w:hyperlink w:anchor="_Toc221641334" w:history="1">
+          <w:hyperlink w:anchor="_Toc225346805" w:history="1">
             <w:r>
               <w:rPr>
                 <w:rStyle w:val="Hiperligao"/>
                 <w:noProof/>
               </w:rPr>
-              <w:t>6.2 Género e Mecânicas Principais</w:t>
+              <w:t>9.2 Erros de Colisão e Escalamento em Runtime</w:t>
             </w:r>
             <w:r>
               <w:rPr>
@@ -2136,7 +3584,7 @@
                 <w:noProof/>
                 <w:webHidden/>
               </w:rPr>
-              <w:instrText xml:space="preserve"> PAGEREF _Toc221641334 \h </w:instrText>
+              <w:instrText xml:space="preserve"> PAGEREF _Toc225346805 \h </w:instrText>
             </w:r>
             <w:r>
               <w:rPr>
@@ -2156,7 +3604,7 @@
                 <w:noProof/>
                 <w:webHidden/>
               </w:rPr>
-              <w:t>25</w:t>
+              <w:t>36</w:t>
             </w:r>
             <w:r>
               <w:rPr>
@@ -2179,13 +3627,13 @@
               <w:lang w:eastAsia="pt-PT"/>
             </w:rPr>
           </w:pPr>
-          <w:hyperlink w:anchor="_Toc221641335" w:history="1">
+          <w:hyperlink w:anchor="_Toc225346806" w:history="1">
             <w:r>
               <w:rPr>
                 <w:rStyle w:val="Hiperligao"/>
                 <w:noProof/>
               </w:rPr>
-              <w:t>6.3 Estrutura Geral do Jogo</w:t>
+              <w:t>9.3 Loop de Transição Entre Cenas</w:t>
             </w:r>
             <w:r>
               <w:rPr>
@@ -2206,7 +3654,7 @@
                 <w:noProof/>
                 <w:webHidden/>
               </w:rPr>
-              <w:instrText xml:space="preserve"> PAGEREF _Toc221641335 \h </w:instrText>
+              <w:instrText xml:space="preserve"> PAGEREF _Toc225346806 \h </w:instrText>
             </w:r>
             <w:r>
               <w:rPr>
@@ -2226,7 +3674,7 @@
                 <w:noProof/>
                 <w:webHidden/>
               </w:rPr>
-              <w:t>26</w:t>
+              <w:t>37</w:t>
             </w:r>
             <w:r>
               <w:rPr>
@@ -2249,13 +3697,13 @@
               <w:lang w:eastAsia="pt-PT"/>
             </w:rPr>
           </w:pPr>
-          <w:hyperlink w:anchor="_Toc221641336" w:history="1">
+          <w:hyperlink w:anchor="_Toc225346807" w:history="1">
             <w:r>
               <w:rPr>
                 <w:rStyle w:val="Hiperligao"/>
                 <w:noProof/>
               </w:rPr>
-              <w:t>6.4 Organização das Cenas</w:t>
+              <w:t>9.4 Problemas com Plataformas One-Way</w:t>
             </w:r>
             <w:r>
               <w:rPr>
@@ -2276,7 +3724,7 @@
                 <w:noProof/>
                 <w:webHidden/>
               </w:rPr>
-              <w:instrText xml:space="preserve"> PAGEREF _Toc221641336 \h </w:instrText>
+              <w:instrText xml:space="preserve"> PAGEREF _Toc225346807 \h </w:instrText>
             </w:r>
             <w:r>
               <w:rPr>
@@ -2296,7 +3744,7 @@
                 <w:noProof/>
                 <w:webHidden/>
               </w:rPr>
-              <w:t>27</w:t>
+              <w:t>38</w:t>
             </w:r>
             <w:r>
               <w:rPr>
@@ -2319,13 +3767,13 @@
               <w:lang w:eastAsia="pt-PT"/>
             </w:rPr>
           </w:pPr>
-          <w:hyperlink w:anchor="_Toc221641337" w:history="1">
+          <w:hyperlink w:anchor="_Toc225346808" w:history="1">
             <w:r>
               <w:rPr>
                 <w:rStyle w:val="Hiperligao"/>
                 <w:noProof/>
               </w:rPr>
-              <w:t>6.5 Planeamento das Funcionalidades</w:t>
+              <w:t>9.5 Depuração e Resolução de Bugs</w:t>
             </w:r>
             <w:r>
               <w:rPr>
@@ -2346,7 +3794,7 @@
                 <w:noProof/>
                 <w:webHidden/>
               </w:rPr>
-              <w:instrText xml:space="preserve"> PAGEREF _Toc221641337 \h </w:instrText>
+              <w:instrText xml:space="preserve"> PAGEREF _Toc225346808 \h </w:instrText>
             </w:r>
             <w:r>
               <w:rPr>
@@ -2366,7 +3814,7 @@
                 <w:noProof/>
                 <w:webHidden/>
               </w:rPr>
-              <w:t>27</w:t>
+              <w:t>39</w:t>
             </w:r>
             <w:r>
               <w:rPr>
@@ -2379,919 +3827,13 @@
         </w:p>
         <w:p>
           <w:pPr>
-            <w:pStyle w:val="ndice1"/>
-            <w:tabs>
-              <w:tab w:val="right" w:leader="dot" w:pos="8494"/>
-            </w:tabs>
             <w:rPr>
-              <w:rFonts w:eastAsiaTheme="minorEastAsia"/>
-              <w:noProof/>
-              <w:lang w:eastAsia="pt-PT"/>
+              <w:rFonts w:ascii="Times New Roman" w:hAnsi="Times New Roman" w:cs="Times New Roman"/>
             </w:rPr>
           </w:pPr>
-          <w:hyperlink w:anchor="_Toc221641338" w:history="1">
-            <w:r>
-              <w:rPr>
-                <w:rStyle w:val="Hiperligao"/>
-                <w:noProof/>
-              </w:rPr>
-              <w:t>7. Arquitetura Técnica do Jogo</w:t>
-            </w:r>
-            <w:r>
-              <w:rPr>
-                <w:noProof/>
-                <w:webHidden/>
-              </w:rPr>
-              <w:tab/>
-            </w:r>
-            <w:r>
-              <w:rPr>
-                <w:noProof/>
-                <w:webHidden/>
-              </w:rPr>
-              <w:fldChar w:fldCharType="begin"/>
-            </w:r>
-            <w:r>
-              <w:rPr>
-                <w:noProof/>
-                <w:webHidden/>
-              </w:rPr>
-              <w:instrText xml:space="preserve"> PAGEREF _Toc221641338 \h </w:instrText>
-            </w:r>
-            <w:r>
-              <w:rPr>
-                <w:noProof/>
-                <w:webHidden/>
-              </w:rPr>
-            </w:r>
-            <w:r>
-              <w:rPr>
-                <w:noProof/>
-                <w:webHidden/>
-              </w:rPr>
-              <w:fldChar w:fldCharType="separate"/>
-            </w:r>
-            <w:r>
-              <w:rPr>
-                <w:noProof/>
-                <w:webHidden/>
-              </w:rPr>
-              <w:t>28</w:t>
-            </w:r>
-            <w:r>
-              <w:rPr>
-                <w:noProof/>
-                <w:webHidden/>
-              </w:rPr>
-              <w:fldChar w:fldCharType="end"/>
-            </w:r>
-          </w:hyperlink>
-        </w:p>
-        <w:p>
-          <w:pPr>
-            <w:pStyle w:val="ndice2"/>
-            <w:tabs>
-              <w:tab w:val="right" w:leader="dot" w:pos="8494"/>
-            </w:tabs>
-            <w:rPr>
-              <w:rFonts w:eastAsiaTheme="minorEastAsia"/>
-              <w:noProof/>
-              <w:lang w:eastAsia="pt-PT"/>
-            </w:rPr>
-          </w:pPr>
-          <w:hyperlink w:anchor="_Toc221641339" w:history="1">
-            <w:r>
-              <w:rPr>
-                <w:rStyle w:val="Hiperligao"/>
-                <w:noProof/>
-              </w:rPr>
-              <w:t>7.1 Organização do Projeto em Godot</w:t>
-            </w:r>
-            <w:r>
-              <w:rPr>
-                <w:noProof/>
-                <w:webHidden/>
-              </w:rPr>
-              <w:tab/>
-            </w:r>
-            <w:r>
-              <w:rPr>
-                <w:noProof/>
-                <w:webHidden/>
-              </w:rPr>
-              <w:fldChar w:fldCharType="begin"/>
-            </w:r>
-            <w:r>
-              <w:rPr>
-                <w:noProof/>
-                <w:webHidden/>
-              </w:rPr>
-              <w:instrText xml:space="preserve"> PAGEREF _Toc221641339 \h </w:instrText>
-            </w:r>
-            <w:r>
-              <w:rPr>
-                <w:noProof/>
-                <w:webHidden/>
-              </w:rPr>
-            </w:r>
-            <w:r>
-              <w:rPr>
-                <w:noProof/>
-                <w:webHidden/>
-              </w:rPr>
-              <w:fldChar w:fldCharType="separate"/>
-            </w:r>
-            <w:r>
-              <w:rPr>
-                <w:noProof/>
-                <w:webHidden/>
-              </w:rPr>
-              <w:t>28</w:t>
-            </w:r>
-            <w:r>
-              <w:rPr>
-                <w:noProof/>
-                <w:webHidden/>
-              </w:rPr>
-              <w:fldChar w:fldCharType="end"/>
-            </w:r>
-          </w:hyperlink>
-        </w:p>
-        <w:p>
-          <w:pPr>
-            <w:pStyle w:val="ndice2"/>
-            <w:tabs>
-              <w:tab w:val="right" w:leader="dot" w:pos="8494"/>
-            </w:tabs>
-            <w:rPr>
-              <w:rFonts w:eastAsiaTheme="minorEastAsia"/>
-              <w:noProof/>
-              <w:lang w:eastAsia="pt-PT"/>
-            </w:rPr>
-          </w:pPr>
-          <w:hyperlink w:anchor="_Toc221641340" w:history="1">
-            <w:r>
-              <w:rPr>
-                <w:rStyle w:val="Hiperligao"/>
-                <w:noProof/>
-              </w:rPr>
-              <w:t>7.2 Sistema de Cenas e Modularidade</w:t>
-            </w:r>
-            <w:r>
-              <w:rPr>
-                <w:noProof/>
-                <w:webHidden/>
-              </w:rPr>
-              <w:tab/>
-            </w:r>
-            <w:r>
-              <w:rPr>
-                <w:noProof/>
-                <w:webHidden/>
-              </w:rPr>
-              <w:fldChar w:fldCharType="begin"/>
-            </w:r>
-            <w:r>
-              <w:rPr>
-                <w:noProof/>
-                <w:webHidden/>
-              </w:rPr>
-              <w:instrText xml:space="preserve"> PAGEREF _Toc221641340 \h </w:instrText>
-            </w:r>
-            <w:r>
-              <w:rPr>
-                <w:noProof/>
-                <w:webHidden/>
-              </w:rPr>
-            </w:r>
-            <w:r>
-              <w:rPr>
-                <w:noProof/>
-                <w:webHidden/>
-              </w:rPr>
-              <w:fldChar w:fldCharType="separate"/>
-            </w:r>
-            <w:r>
-              <w:rPr>
-                <w:noProof/>
-                <w:webHidden/>
-              </w:rPr>
-              <w:t>29</w:t>
-            </w:r>
-            <w:r>
-              <w:rPr>
-                <w:noProof/>
-                <w:webHidden/>
-              </w:rPr>
-              <w:fldChar w:fldCharType="end"/>
-            </w:r>
-          </w:hyperlink>
-        </w:p>
-        <w:p>
-          <w:pPr>
-            <w:pStyle w:val="ndice2"/>
-            <w:tabs>
-              <w:tab w:val="right" w:leader="dot" w:pos="8494"/>
-            </w:tabs>
-            <w:rPr>
-              <w:rFonts w:eastAsiaTheme="minorEastAsia"/>
-              <w:noProof/>
-              <w:lang w:eastAsia="pt-PT"/>
-            </w:rPr>
-          </w:pPr>
-          <w:hyperlink w:anchor="_Toc221641341" w:history="1">
-            <w:r>
-              <w:rPr>
-                <w:rStyle w:val="Hiperligao"/>
-                <w:noProof/>
-              </w:rPr>
-              <w:t>7.3 SceneManager e LevelTransition</w:t>
-            </w:r>
-            <w:r>
-              <w:rPr>
-                <w:noProof/>
-                <w:webHidden/>
-              </w:rPr>
-              <w:tab/>
-            </w:r>
-            <w:r>
-              <w:rPr>
-                <w:noProof/>
-                <w:webHidden/>
-              </w:rPr>
-              <w:fldChar w:fldCharType="begin"/>
-            </w:r>
-            <w:r>
-              <w:rPr>
-                <w:noProof/>
-                <w:webHidden/>
-              </w:rPr>
-              <w:instrText xml:space="preserve"> PAGEREF _Toc221641341 \h </w:instrText>
-            </w:r>
-            <w:r>
-              <w:rPr>
-                <w:noProof/>
-                <w:webHidden/>
-              </w:rPr>
-            </w:r>
-            <w:r>
-              <w:rPr>
-                <w:noProof/>
-                <w:webHidden/>
-              </w:rPr>
-              <w:fldChar w:fldCharType="separate"/>
-            </w:r>
-            <w:r>
-              <w:rPr>
-                <w:noProof/>
-                <w:webHidden/>
-              </w:rPr>
-              <w:t>30</w:t>
-            </w:r>
-            <w:r>
-              <w:rPr>
-                <w:noProof/>
-                <w:webHidden/>
-              </w:rPr>
-              <w:fldChar w:fldCharType="end"/>
-            </w:r>
-          </w:hyperlink>
-        </w:p>
-        <w:p>
-          <w:pPr>
-            <w:pStyle w:val="ndice2"/>
-            <w:tabs>
-              <w:tab w:val="right" w:leader="dot" w:pos="8494"/>
-            </w:tabs>
-            <w:rPr>
-              <w:rFonts w:eastAsiaTheme="minorEastAsia"/>
-              <w:noProof/>
-              <w:lang w:eastAsia="pt-PT"/>
-            </w:rPr>
-          </w:pPr>
-          <w:hyperlink w:anchor="_Toc221641342" w:history="1">
-            <w:r>
-              <w:rPr>
-                <w:rStyle w:val="Hiperligao"/>
-                <w:noProof/>
-              </w:rPr>
-              <w:t>7.4 Máquina de Estados do Jogador</w:t>
-            </w:r>
-            <w:r>
-              <w:rPr>
-                <w:noProof/>
-                <w:webHidden/>
-              </w:rPr>
-              <w:tab/>
-            </w:r>
-            <w:r>
-              <w:rPr>
-                <w:noProof/>
-                <w:webHidden/>
-              </w:rPr>
-              <w:fldChar w:fldCharType="begin"/>
-            </w:r>
-            <w:r>
-              <w:rPr>
-                <w:noProof/>
-                <w:webHidden/>
-              </w:rPr>
-              <w:instrText xml:space="preserve"> PAGEREF _Toc221641342 \h </w:instrText>
-            </w:r>
-            <w:r>
-              <w:rPr>
-                <w:noProof/>
-                <w:webHidden/>
-              </w:rPr>
-            </w:r>
-            <w:r>
-              <w:rPr>
-                <w:noProof/>
-                <w:webHidden/>
-              </w:rPr>
-              <w:fldChar w:fldCharType="separate"/>
-            </w:r>
-            <w:r>
-              <w:rPr>
-                <w:noProof/>
-                <w:webHidden/>
-              </w:rPr>
-              <w:t>31</w:t>
-            </w:r>
-            <w:r>
-              <w:rPr>
-                <w:noProof/>
-                <w:webHidden/>
-              </w:rPr>
-              <w:fldChar w:fldCharType="end"/>
-            </w:r>
-          </w:hyperlink>
-        </w:p>
-        <w:p>
-          <w:pPr>
-            <w:pStyle w:val="ndice2"/>
-            <w:tabs>
-              <w:tab w:val="right" w:leader="dot" w:pos="8494"/>
-            </w:tabs>
-            <w:rPr>
-              <w:rFonts w:eastAsiaTheme="minorEastAsia"/>
-              <w:noProof/>
-              <w:lang w:eastAsia="pt-PT"/>
-            </w:rPr>
-          </w:pPr>
-          <w:hyperlink w:anchor="_Toc221641343" w:history="1">
-            <w:r>
-              <w:rPr>
-                <w:rStyle w:val="Hiperligao"/>
-                <w:noProof/>
-              </w:rPr>
-              <w:t>7.5 Sistema de Animações</w:t>
-            </w:r>
-            <w:r>
-              <w:rPr>
-                <w:noProof/>
-                <w:webHidden/>
-              </w:rPr>
-              <w:tab/>
-            </w:r>
-            <w:r>
-              <w:rPr>
-                <w:noProof/>
-                <w:webHidden/>
-              </w:rPr>
-              <w:fldChar w:fldCharType="begin"/>
-            </w:r>
-            <w:r>
-              <w:rPr>
-                <w:noProof/>
-                <w:webHidden/>
-              </w:rPr>
-              <w:instrText xml:space="preserve"> PAGEREF _Toc221641343 \h </w:instrText>
-            </w:r>
-            <w:r>
-              <w:rPr>
-                <w:noProof/>
-                <w:webHidden/>
-              </w:rPr>
-            </w:r>
-            <w:r>
-              <w:rPr>
-                <w:noProof/>
-                <w:webHidden/>
-              </w:rPr>
-              <w:fldChar w:fldCharType="separate"/>
-            </w:r>
-            <w:r>
-              <w:rPr>
-                <w:noProof/>
-                <w:webHidden/>
-              </w:rPr>
-              <w:t>32</w:t>
-            </w:r>
-            <w:r>
-              <w:rPr>
-                <w:noProof/>
-                <w:webHidden/>
-              </w:rPr>
-              <w:fldChar w:fldCharType="end"/>
-            </w:r>
-          </w:hyperlink>
-        </w:p>
-        <w:p>
-          <w:pPr>
-            <w:pStyle w:val="ndice2"/>
-            <w:tabs>
-              <w:tab w:val="right" w:leader="dot" w:pos="8494"/>
-            </w:tabs>
-            <w:rPr>
-              <w:rFonts w:eastAsiaTheme="minorEastAsia"/>
-              <w:noProof/>
-              <w:lang w:eastAsia="pt-PT"/>
-            </w:rPr>
-          </w:pPr>
-          <w:hyperlink w:anchor="_Toc221641344" w:history="1">
-            <w:r>
-              <w:rPr>
-                <w:rStyle w:val="Hiperligao"/>
-                <w:noProof/>
-              </w:rPr>
-              <w:t>7.6 Sistema de Colisões e Física</w:t>
-            </w:r>
-            <w:r>
-              <w:rPr>
-                <w:noProof/>
-                <w:webHidden/>
-              </w:rPr>
-              <w:tab/>
-            </w:r>
-            <w:r>
-              <w:rPr>
-                <w:noProof/>
-                <w:webHidden/>
-              </w:rPr>
-              <w:fldChar w:fldCharType="begin"/>
-            </w:r>
-            <w:r>
-              <w:rPr>
-                <w:noProof/>
-                <w:webHidden/>
-              </w:rPr>
-              <w:instrText xml:space="preserve"> PAGEREF _Toc221641344 \h </w:instrText>
-            </w:r>
-            <w:r>
-              <w:rPr>
-                <w:noProof/>
-                <w:webHidden/>
-              </w:rPr>
-            </w:r>
-            <w:r>
-              <w:rPr>
-                <w:noProof/>
-                <w:webHidden/>
-              </w:rPr>
-              <w:fldChar w:fldCharType="separate"/>
-            </w:r>
-            <w:r>
-              <w:rPr>
-                <w:noProof/>
-                <w:webHidden/>
-              </w:rPr>
-              <w:t>33</w:t>
-            </w:r>
-            <w:r>
-              <w:rPr>
-                <w:noProof/>
-                <w:webHidden/>
-              </w:rPr>
-              <w:fldChar w:fldCharType="end"/>
-            </w:r>
-          </w:hyperlink>
-        </w:p>
-        <w:p>
-          <w:pPr>
-            <w:pStyle w:val="ndice1"/>
-            <w:tabs>
-              <w:tab w:val="right" w:leader="dot" w:pos="8494"/>
-            </w:tabs>
-            <w:rPr>
-              <w:rFonts w:eastAsiaTheme="minorEastAsia"/>
-              <w:noProof/>
-              <w:lang w:eastAsia="pt-PT"/>
-            </w:rPr>
-          </w:pPr>
-          <w:hyperlink w:anchor="_Toc221641345" w:history="1">
-            <w:r>
-              <w:rPr>
-                <w:rStyle w:val="Hiperligao"/>
-                <w:noProof/>
-              </w:rPr>
-              <w:t>8. Problemas Encontrados e Resolução</w:t>
-            </w:r>
-            <w:r>
-              <w:rPr>
-                <w:noProof/>
-                <w:webHidden/>
-              </w:rPr>
-              <w:tab/>
-            </w:r>
-            <w:r>
-              <w:rPr>
-                <w:noProof/>
-                <w:webHidden/>
-              </w:rPr>
-              <w:fldChar w:fldCharType="begin"/>
-            </w:r>
-            <w:r>
-              <w:rPr>
-                <w:noProof/>
-                <w:webHidden/>
-              </w:rPr>
-              <w:instrText xml:space="preserve"> PAGEREF _Toc221641345 \h </w:instrText>
-            </w:r>
-            <w:r>
-              <w:rPr>
-                <w:noProof/>
-                <w:webHidden/>
-              </w:rPr>
-            </w:r>
-            <w:r>
-              <w:rPr>
-                <w:noProof/>
-                <w:webHidden/>
-              </w:rPr>
-              <w:fldChar w:fldCharType="separate"/>
-            </w:r>
-            <w:r>
-              <w:rPr>
-                <w:noProof/>
-                <w:webHidden/>
-              </w:rPr>
-              <w:t>34</w:t>
-            </w:r>
-            <w:r>
-              <w:rPr>
-                <w:noProof/>
-                <w:webHidden/>
-              </w:rPr>
-              <w:fldChar w:fldCharType="end"/>
-            </w:r>
-          </w:hyperlink>
-        </w:p>
-        <w:p>
-          <w:pPr>
-            <w:pStyle w:val="ndice2"/>
-            <w:tabs>
-              <w:tab w:val="right" w:leader="dot" w:pos="8494"/>
-            </w:tabs>
-            <w:rPr>
-              <w:rFonts w:eastAsiaTheme="minorEastAsia"/>
-              <w:noProof/>
-              <w:lang w:eastAsia="pt-PT"/>
-            </w:rPr>
-          </w:pPr>
-          <w:hyperlink w:anchor="_Toc221641346" w:history="1">
-            <w:r>
-              <w:rPr>
-                <w:rStyle w:val="Hiperligao"/>
-                <w:noProof/>
-              </w:rPr>
-              <w:t>8.1 Problemas com Transições de Níveis</w:t>
-            </w:r>
-            <w:r>
-              <w:rPr>
-                <w:noProof/>
-                <w:webHidden/>
-              </w:rPr>
-              <w:tab/>
-            </w:r>
-            <w:r>
-              <w:rPr>
-                <w:noProof/>
-                <w:webHidden/>
-              </w:rPr>
-              <w:fldChar w:fldCharType="begin"/>
-            </w:r>
-            <w:r>
-              <w:rPr>
-                <w:noProof/>
-                <w:webHidden/>
-              </w:rPr>
-              <w:instrText xml:space="preserve"> PAGEREF _Toc221641346 \h </w:instrText>
-            </w:r>
-            <w:r>
-              <w:rPr>
-                <w:noProof/>
-                <w:webHidden/>
-              </w:rPr>
-            </w:r>
-            <w:r>
-              <w:rPr>
-                <w:noProof/>
-                <w:webHidden/>
-              </w:rPr>
-              <w:fldChar w:fldCharType="separate"/>
-            </w:r>
-            <w:r>
-              <w:rPr>
-                <w:noProof/>
-                <w:webHidden/>
-              </w:rPr>
-              <w:t>34</w:t>
-            </w:r>
-            <w:r>
-              <w:rPr>
-                <w:noProof/>
-                <w:webHidden/>
-              </w:rPr>
-              <w:fldChar w:fldCharType="end"/>
-            </w:r>
-          </w:hyperlink>
-        </w:p>
-        <w:p>
-          <w:pPr>
-            <w:pStyle w:val="ndice2"/>
-            <w:tabs>
-              <w:tab w:val="right" w:leader="dot" w:pos="8494"/>
-            </w:tabs>
-            <w:rPr>
-              <w:rFonts w:eastAsiaTheme="minorEastAsia"/>
-              <w:noProof/>
-              <w:lang w:eastAsia="pt-PT"/>
-            </w:rPr>
-          </w:pPr>
-          <w:hyperlink w:anchor="_Toc221641347" w:history="1">
-            <w:r>
-              <w:rPr>
-                <w:rStyle w:val="Hiperligao"/>
-                <w:noProof/>
-              </w:rPr>
-              <w:t>8.2 Erros de Colisão e Escalamento em Runtime</w:t>
-            </w:r>
-            <w:r>
-              <w:rPr>
-                <w:noProof/>
-                <w:webHidden/>
-              </w:rPr>
-              <w:tab/>
-            </w:r>
-            <w:r>
-              <w:rPr>
-                <w:noProof/>
-                <w:webHidden/>
-              </w:rPr>
-              <w:fldChar w:fldCharType="begin"/>
-            </w:r>
-            <w:r>
-              <w:rPr>
-                <w:noProof/>
-                <w:webHidden/>
-              </w:rPr>
-              <w:instrText xml:space="preserve"> PAGEREF _Toc221641347 \h </w:instrText>
-            </w:r>
-            <w:r>
-              <w:rPr>
-                <w:noProof/>
-                <w:webHidden/>
-              </w:rPr>
-            </w:r>
-            <w:r>
-              <w:rPr>
-                <w:noProof/>
-                <w:webHidden/>
-              </w:rPr>
-              <w:fldChar w:fldCharType="separate"/>
-            </w:r>
-            <w:r>
-              <w:rPr>
-                <w:noProof/>
-                <w:webHidden/>
-              </w:rPr>
-              <w:t>35</w:t>
-            </w:r>
-            <w:r>
-              <w:rPr>
-                <w:noProof/>
-                <w:webHidden/>
-              </w:rPr>
-              <w:fldChar w:fldCharType="end"/>
-            </w:r>
-          </w:hyperlink>
-        </w:p>
-        <w:p>
-          <w:pPr>
-            <w:pStyle w:val="ndice2"/>
-            <w:tabs>
-              <w:tab w:val="right" w:leader="dot" w:pos="8494"/>
-            </w:tabs>
-            <w:rPr>
-              <w:rFonts w:eastAsiaTheme="minorEastAsia"/>
-              <w:noProof/>
-              <w:lang w:eastAsia="pt-PT"/>
-            </w:rPr>
-          </w:pPr>
-          <w:hyperlink w:anchor="_Toc221641348" w:history="1">
-            <w:r>
-              <w:rPr>
-                <w:rStyle w:val="Hiperligao"/>
-                <w:noProof/>
-              </w:rPr>
-              <w:t>8.3 Loop de Transição Entre Cenas</w:t>
-            </w:r>
-            <w:r>
-              <w:rPr>
-                <w:noProof/>
-                <w:webHidden/>
-              </w:rPr>
-              <w:tab/>
-            </w:r>
-            <w:r>
-              <w:rPr>
-                <w:noProof/>
-                <w:webHidden/>
-              </w:rPr>
-              <w:fldChar w:fldCharType="begin"/>
-            </w:r>
-            <w:r>
-              <w:rPr>
-                <w:noProof/>
-                <w:webHidden/>
-              </w:rPr>
-              <w:instrText xml:space="preserve"> PAGEREF _Toc221641348 \h </w:instrText>
-            </w:r>
-            <w:r>
-              <w:rPr>
-                <w:noProof/>
-                <w:webHidden/>
-              </w:rPr>
-            </w:r>
-            <w:r>
-              <w:rPr>
-                <w:noProof/>
-                <w:webHidden/>
-              </w:rPr>
-              <w:fldChar w:fldCharType="separate"/>
-            </w:r>
-            <w:r>
-              <w:rPr>
-                <w:noProof/>
-                <w:webHidden/>
-              </w:rPr>
-              <w:t>36</w:t>
-            </w:r>
-            <w:r>
-              <w:rPr>
-                <w:noProof/>
-                <w:webHidden/>
-              </w:rPr>
-              <w:fldChar w:fldCharType="end"/>
-            </w:r>
-          </w:hyperlink>
-        </w:p>
-        <w:p>
-          <w:pPr>
-            <w:pStyle w:val="ndice2"/>
-            <w:tabs>
-              <w:tab w:val="right" w:leader="dot" w:pos="8494"/>
-            </w:tabs>
-            <w:rPr>
-              <w:rFonts w:eastAsiaTheme="minorEastAsia"/>
-              <w:noProof/>
-              <w:lang w:eastAsia="pt-PT"/>
-            </w:rPr>
-          </w:pPr>
-          <w:hyperlink w:anchor="_Toc221641349" w:history="1">
-            <w:r>
-              <w:rPr>
-                <w:rStyle w:val="Hiperligao"/>
-                <w:noProof/>
-              </w:rPr>
-              <w:t>8.4 Problemas com Plataformas One-Way</w:t>
-            </w:r>
-            <w:r>
-              <w:rPr>
-                <w:noProof/>
-                <w:webHidden/>
-              </w:rPr>
-              <w:tab/>
-            </w:r>
-            <w:r>
-              <w:rPr>
-                <w:noProof/>
-                <w:webHidden/>
-              </w:rPr>
-              <w:fldChar w:fldCharType="begin"/>
-            </w:r>
-            <w:r>
-              <w:rPr>
-                <w:noProof/>
-                <w:webHidden/>
-              </w:rPr>
-              <w:instrText xml:space="preserve"> PAGEREF _Toc221641349 \h </w:instrText>
-            </w:r>
-            <w:r>
-              <w:rPr>
-                <w:noProof/>
-                <w:webHidden/>
-              </w:rPr>
-            </w:r>
-            <w:r>
-              <w:rPr>
-                <w:noProof/>
-                <w:webHidden/>
-              </w:rPr>
-              <w:fldChar w:fldCharType="separate"/>
-            </w:r>
-            <w:r>
-              <w:rPr>
-                <w:noProof/>
-                <w:webHidden/>
-              </w:rPr>
-              <w:t>37</w:t>
-            </w:r>
-            <w:r>
-              <w:rPr>
-                <w:noProof/>
-                <w:webHidden/>
-              </w:rPr>
-              <w:fldChar w:fldCharType="end"/>
-            </w:r>
-          </w:hyperlink>
-        </w:p>
-        <w:p>
-          <w:pPr>
-            <w:pStyle w:val="ndice2"/>
-            <w:tabs>
-              <w:tab w:val="right" w:leader="dot" w:pos="8494"/>
-            </w:tabs>
-            <w:rPr>
-              <w:rFonts w:eastAsiaTheme="minorEastAsia"/>
-              <w:noProof/>
-              <w:lang w:eastAsia="pt-PT"/>
-            </w:rPr>
-          </w:pPr>
-          <w:hyperlink w:anchor="_Toc221641350" w:history="1">
-            <w:r>
-              <w:rPr>
-                <w:rStyle w:val="Hiperligao"/>
-                <w:noProof/>
-              </w:rPr>
-              <w:t>8.5 Depuração e Resolução de Bugs</w:t>
-            </w:r>
-            <w:r>
-              <w:rPr>
-                <w:noProof/>
-                <w:webHidden/>
-              </w:rPr>
-              <w:tab/>
-            </w:r>
-            <w:r>
-              <w:rPr>
-                <w:noProof/>
-                <w:webHidden/>
-              </w:rPr>
-              <w:fldChar w:fldCharType="begin"/>
-            </w:r>
-            <w:r>
-              <w:rPr>
-                <w:noProof/>
-                <w:webHidden/>
-              </w:rPr>
-              <w:instrText xml:space="preserve"> PAGEREF _Toc221641350 \h </w:instrText>
-            </w:r>
-            <w:r>
-              <w:rPr>
-                <w:noProof/>
-                <w:webHidden/>
-              </w:rPr>
-            </w:r>
-            <w:r>
-              <w:rPr>
-                <w:noProof/>
-                <w:webHidden/>
-              </w:rPr>
-              <w:fldChar w:fldCharType="separate"/>
-            </w:r>
-            <w:r>
-              <w:rPr>
-                <w:noProof/>
-                <w:webHidden/>
-              </w:rPr>
-              <w:t>38</w:t>
-            </w:r>
-            <w:r>
-              <w:rPr>
-                <w:noProof/>
-                <w:webHidden/>
-              </w:rPr>
-              <w:fldChar w:fldCharType="end"/>
-            </w:r>
-          </w:hyperlink>
-        </w:p>
-        <w:p>
           <w:r>
             <w:rPr>
-              <w:b/>
-              <w:bCs/>
+              <w:rFonts w:ascii="Times New Roman" w:hAnsi="Times New Roman" w:cs="Times New Roman"/>
             </w:rPr>
             <w:fldChar w:fldCharType="end"/>
           </w:r>
@@ -3312,141 +3854,26 @@
     </w:p>
     <w:p>
       <w:pPr>
-        <w:pStyle w:val="Ttulo2"/>
-        <w:numPr>
-          <w:ilvl w:val="1"/>
-          <w:numId w:val="32"/>
-        </w:numPr>
-      </w:pPr>
-      <w:bookmarkStart w:id="5" w:name="_Toc221641319"/>
-      <w:bookmarkStart w:id="6" w:name="_Toc221641330"/>
-      <w:r>
-        <w:lastRenderedPageBreak/>
-        <w:t>Fundamentação d</w:t>
-      </w:r>
-      <w:r>
-        <w:t>a</w:t>
-      </w:r>
-      <w:r>
-        <w:t xml:space="preserve"> </w:t>
-      </w:r>
-      <w:bookmarkEnd w:id="6"/>
-      <w:r>
-        <w:t>Escolha do Projeto</w:t>
-      </w:r>
-    </w:p>
-    <w:p>
-      <w:pPr>
-        <w:spacing w:after="0" w:line="240" w:lineRule="auto"/>
-        <w:ind w:firstLine="360"/>
-        <w:rPr>
-          <w:rFonts w:ascii="Times New Roman" w:eastAsia="Times New Roman" w:hAnsi="Times New Roman" w:cs="Times New Roman"/>
-          <w:sz w:val="24"/>
-          <w:szCs w:val="24"/>
-          <w:lang w:eastAsia="pt-PT"/>
-        </w:rPr>
-      </w:pPr>
-      <w:r>
-        <w:rPr>
-          <w:rFonts w:ascii="Times New Roman" w:eastAsia="Times New Roman" w:hAnsi="Times New Roman" w:cs="Times New Roman"/>
-          <w:sz w:val="24"/>
-          <w:szCs w:val="24"/>
-          <w:lang w:eastAsia="pt-PT"/>
-        </w:rPr>
-        <w:t xml:space="preserve">A escolha do tema recaiu sobre o desenvolvimento de um videojogo devido à sua natureza multidisciplinar, que combina programação, design gráfico, narrativa, lógica, criatividade e resolução de problemas. Optar por um </w:t>
-      </w:r>
-      <w:proofErr w:type="spellStart"/>
-      <w:r>
-        <w:rPr>
-          <w:rFonts w:ascii="Times New Roman" w:eastAsia="Times New Roman" w:hAnsi="Times New Roman" w:cs="Times New Roman"/>
-          <w:sz w:val="24"/>
-          <w:szCs w:val="24"/>
-          <w:lang w:eastAsia="pt-PT"/>
-        </w:rPr>
-        <w:t>Metroidvania</w:t>
-      </w:r>
-      <w:proofErr w:type="spellEnd"/>
-      <w:r>
-        <w:rPr>
-          <w:rFonts w:ascii="Times New Roman" w:eastAsia="Times New Roman" w:hAnsi="Times New Roman" w:cs="Times New Roman"/>
-          <w:sz w:val="24"/>
-          <w:szCs w:val="24"/>
-          <w:lang w:eastAsia="pt-PT"/>
-        </w:rPr>
-        <w:t xml:space="preserve"> 2D permite explorar uma vasta gama de desafios técnicos e criativos inerentes ao game design moderno, tais como a implementação de máquinas de estado, físicas personalizadas, gestão de cenas e sistemas de progressão não-linear, demonstrando de forma abrangente as competências adquiridas ao longo do curso.</w:t>
-      </w:r>
-    </w:p>
-    <w:p>
-      <w:pPr>
-        <w:rPr>
-          <w:lang w:eastAsia="pt-PT"/>
-        </w:rPr>
-      </w:pPr>
-      <w:r>
-        <w:rPr>
-          <w:lang w:eastAsia="pt-PT"/>
-        </w:rPr>
-        <w:br w:type="page"/>
-      </w:r>
-    </w:p>
-    <w:p>
-      <w:pPr>
-        <w:pStyle w:val="Ttulo2"/>
-      </w:pPr>
-      <w:r>
-        <w:lastRenderedPageBreak/>
-        <w:t xml:space="preserve">1.2 </w:t>
-      </w:r>
-      <w:r>
-        <w:t>Finalidades do Projeto</w:t>
-      </w:r>
-    </w:p>
-    <w:p>
-      <w:pPr>
-        <w:ind w:firstLine="708"/>
-        <w:rPr>
-          <w:lang w:eastAsia="pt-PT"/>
-        </w:rPr>
-      </w:pPr>
-      <w:r>
-        <w:rPr>
-          <w:lang w:eastAsia="pt-PT"/>
-        </w:rPr>
-        <w:t>Este projeto tem como finalidade principal a criação de um protótipo funcional e robusto de um jogo 2D, servindo como prova prática das capacidades de desenvolvimento de software, gestão de projeto e pensamento crítico. Visa também consolidar aprendizagens das diversas disciplinas do curso num produto tangível e com potencial de evolução.</w:t>
-      </w:r>
-    </w:p>
-    <w:p>
-      <w:pPr>
-        <w:rPr>
-          <w:rFonts w:ascii="Times New Roman" w:eastAsiaTheme="majorEastAsia" w:hAnsi="Times New Roman" w:cs="Times New Roman"/>
-          <w:b/>
-          <w:bCs/>
-          <w:color w:val="000000" w:themeColor="text1"/>
-          <w:sz w:val="32"/>
-          <w:szCs w:val="32"/>
-        </w:rPr>
-      </w:pPr>
-      <w:r>
+        <w:pStyle w:val="Ttulo1"/>
+        <w:jc w:val="center"/>
         <w:rPr>
           <w:rFonts w:ascii="Times New Roman" w:hAnsi="Times New Roman" w:cs="Times New Roman"/>
           <w:b/>
           <w:bCs/>
           <w:color w:val="000000" w:themeColor="text1"/>
         </w:rPr>
-        <w:br w:type="page"/>
-      </w:r>
-    </w:p>
-    <w:p>
-      <w:pPr>
-        <w:pStyle w:val="Ttulo1"/>
-        <w:jc w:val="center"/>
+      </w:pPr>
+      <w:bookmarkStart w:id="8" w:name="_Toc225346776"/>
+      <w:r>
         <w:rPr>
           <w:rFonts w:ascii="Times New Roman" w:hAnsi="Times New Roman" w:cs="Times New Roman"/>
           <w:b/>
           <w:bCs/>
           <w:color w:val="000000" w:themeColor="text1"/>
         </w:rPr>
-      </w:pPr>
+        <w:lastRenderedPageBreak/>
+        <w:t>2.</w:t>
+      </w:r>
       <w:r>
         <w:rPr>
           <w:rFonts w:ascii="Times New Roman" w:hAnsi="Times New Roman" w:cs="Times New Roman"/>
@@ -3454,19 +3881,9 @@
           <w:bCs/>
           <w:color w:val="000000" w:themeColor="text1"/>
         </w:rPr>
-        <w:lastRenderedPageBreak/>
-        <w:t>2.</w:t>
-      </w:r>
-      <w:r>
-        <w:rPr>
-          <w:rFonts w:ascii="Times New Roman" w:hAnsi="Times New Roman" w:cs="Times New Roman"/>
-          <w:b/>
-          <w:bCs/>
-          <w:color w:val="000000" w:themeColor="text1"/>
-        </w:rPr>
         <w:t>Prova de Aptidão Profissional</w:t>
       </w:r>
-      <w:bookmarkEnd w:id="5"/>
+      <w:bookmarkEnd w:id="8"/>
     </w:p>
     <w:p/>
     <w:p>
@@ -3545,11 +3962,6 @@
           <w:rFonts w:ascii="Times New Roman" w:hAnsi="Times New Roman" w:cs="Times New Roman"/>
         </w:rPr>
         <w:br/>
-      </w:r>
-      <w:r>
-        <w:rPr>
-          <w:rFonts w:ascii="Times New Roman" w:hAnsi="Times New Roman" w:cs="Times New Roman"/>
-        </w:rPr>
         <w:t>A PAP, enquanto projeto de carácter profissional, visa uma efetiva aplicação prática; enquanto projeto desenvolvido no quadro escolar, tem carácter pluridisciplinar e visa a mobilização e a aplicação das aprendizagens produzidas nas diversas áreas de formação.</w:t>
       </w:r>
     </w:p>
@@ -3587,11 +3999,6 @@
           <w:rFonts w:ascii="Times New Roman" w:hAnsi="Times New Roman" w:cs="Times New Roman"/>
         </w:rPr>
         <w:br/>
-      </w:r>
-      <w:r>
-        <w:rPr>
-          <w:rFonts w:ascii="Times New Roman" w:hAnsi="Times New Roman" w:cs="Times New Roman"/>
-        </w:rPr>
         <w:t>A PAP operacionaliza competências essenciais para a resolução de problemas profissionais, nomeadamente:</w:t>
       </w:r>
     </w:p>
@@ -3684,7 +4091,7 @@
         <w:lastRenderedPageBreak/>
         <w:br w:type="page"/>
       </w:r>
-      <w:bookmarkStart w:id="7" w:name="_Toc221641320"/>
+      <w:bookmarkStart w:id="9" w:name="_Toc225346777"/>
       <w:r>
         <w:rPr>
           <w:rFonts w:ascii="Times New Roman" w:hAnsi="Times New Roman" w:cs="Times New Roman"/>
@@ -3697,7 +4104,7 @@
       <w:r>
         <w:t>m que consiste a PAP</w:t>
       </w:r>
-      <w:bookmarkEnd w:id="7"/>
+      <w:bookmarkEnd w:id="9"/>
     </w:p>
     <w:p>
       <w:pPr>
@@ -3762,7 +4169,7 @@
       <w:pPr>
         <w:pStyle w:val="Ttulo1"/>
       </w:pPr>
-      <w:bookmarkStart w:id="8" w:name="_Toc221641321"/>
+      <w:bookmarkStart w:id="10" w:name="_Toc225346778"/>
       <w:r>
         <w:lastRenderedPageBreak/>
         <w:t xml:space="preserve">2.2 </w:t>
@@ -3770,7 +4177,7 @@
       <w:r>
         <w:t>Elementos a envolver na PAP</w:t>
       </w:r>
-      <w:bookmarkEnd w:id="8"/>
+      <w:bookmarkEnd w:id="10"/>
     </w:p>
     <w:p/>
     <w:p>
@@ -3926,7 +4333,7 @@
         <w:pStyle w:val="Ttulo1"/>
         <w:jc w:val="center"/>
       </w:pPr>
-      <w:bookmarkStart w:id="9" w:name="_Toc221641322"/>
+      <w:bookmarkStart w:id="11" w:name="_Toc225346779"/>
       <w:r>
         <w:lastRenderedPageBreak/>
         <w:t>3.</w:t>
@@ -3934,7 +4341,7 @@
       <w:r>
         <w:t>Concretização do Projeto</w:t>
       </w:r>
-      <w:bookmarkEnd w:id="9"/>
+      <w:bookmarkEnd w:id="11"/>
     </w:p>
     <w:p/>
     <w:p>
@@ -4099,7 +4506,7 @@
         <w:pStyle w:val="Ttulo1"/>
         <w:jc w:val="center"/>
       </w:pPr>
-      <w:bookmarkStart w:id="10" w:name="_Toc221641323"/>
+      <w:bookmarkStart w:id="12" w:name="_Toc225346780"/>
       <w:r>
         <w:lastRenderedPageBreak/>
         <w:t xml:space="preserve">3.1 </w:t>
@@ -4107,7 +4514,7 @@
       <w:r>
         <w:t>Identificação do projeto</w:t>
       </w:r>
-      <w:bookmarkEnd w:id="10"/>
+      <w:bookmarkEnd w:id="12"/>
     </w:p>
     <w:p/>
     <w:p>
@@ -4123,10 +4530,7 @@
         <w:jc w:val="both"/>
       </w:pPr>
       <w:r>
-        <w:t>Tema:</w:t>
-      </w:r>
-      <w:r>
-        <w:t xml:space="preserve"> Jogo 2D desenvolvido no </w:t>
+        <w:t xml:space="preserve">Tema: Jogo 2D desenvolvido no </w:t>
       </w:r>
       <w:proofErr w:type="spellStart"/>
       <w:r>
@@ -4142,13 +4546,7 @@
         <w:jc w:val="both"/>
       </w:pPr>
       <w:r>
-        <w:t>Orientadores</w:t>
-      </w:r>
-      <w:r>
-        <w:t xml:space="preserve">: </w:t>
-      </w:r>
-      <w:r>
-        <w:t xml:space="preserve">Jorge </w:t>
+        <w:t xml:space="preserve">Orientadores: Jorge </w:t>
       </w:r>
       <w:r>
         <w:t>Assunção</w:t>
@@ -4162,10 +4560,7 @@
         <w:jc w:val="both"/>
       </w:pPr>
       <w:r>
-        <w:t xml:space="preserve">Autor: </w:t>
-      </w:r>
-      <w:r>
-        <w:t>Marcel Gomes</w:t>
+        <w:t>Autor: Marcel Gomes</w:t>
       </w:r>
     </w:p>
     <w:p>
@@ -4192,7 +4587,7 @@
           <w:lang w:eastAsia="pt-PT"/>
         </w:rPr>
       </w:pPr>
-      <w:bookmarkStart w:id="11" w:name="_Toc221641324"/>
+      <w:bookmarkStart w:id="13" w:name="_Toc225346781"/>
       <w:r>
         <w:lastRenderedPageBreak/>
         <w:t xml:space="preserve">3.2 </w:t>
@@ -4200,7 +4595,7 @@
       <w:r>
         <w:t>Fundamentação da escolha do projeto</w:t>
       </w:r>
-      <w:bookmarkEnd w:id="11"/>
+      <w:bookmarkEnd w:id="13"/>
     </w:p>
     <w:p>
       <w:pPr>
@@ -4294,7 +4689,7 @@
           <w:lang w:eastAsia="pt-PT"/>
         </w:rPr>
       </w:pPr>
-      <w:bookmarkStart w:id="12" w:name="_Toc221641325"/>
+      <w:bookmarkStart w:id="14" w:name="_Toc225346782"/>
       <w:r>
         <w:rPr>
           <w:rFonts w:ascii="Times New Roman" w:eastAsia="Times New Roman" w:hAnsi="Times New Roman" w:cs="Times New Roman"/>
@@ -4308,15 +4703,17 @@
         <w:lastRenderedPageBreak/>
         <w:t>Objetivos</w:t>
       </w:r>
-      <w:bookmarkEnd w:id="12"/>
+      <w:bookmarkEnd w:id="14"/>
     </w:p>
     <w:p>
       <w:pPr>
         <w:pStyle w:val="Ttulo2"/>
       </w:pPr>
+      <w:bookmarkStart w:id="15" w:name="_Toc225346783"/>
       <w:r>
         <w:t>4.1Objetivos principais</w:t>
       </w:r>
+      <w:bookmarkEnd w:id="15"/>
     </w:p>
     <w:p>
       <w:pPr>
@@ -4360,9 +4757,11 @@
       <w:pPr>
         <w:pStyle w:val="Ttulo2"/>
       </w:pPr>
+      <w:bookmarkStart w:id="16" w:name="_Toc225346784"/>
       <w:r>
         <w:t>4.2 Objetivos específicos</w:t>
       </w:r>
+      <w:bookmarkEnd w:id="16"/>
     </w:p>
     <w:p>
       <w:pPr>
@@ -5435,7 +5834,7 @@
           <w:lang w:eastAsia="pt-PT"/>
         </w:rPr>
       </w:pPr>
-      <w:bookmarkStart w:id="13" w:name="_Toc221641326"/>
+      <w:bookmarkStart w:id="17" w:name="_Toc225346785"/>
       <w:r>
         <w:rPr>
           <w:rFonts w:ascii="Times New Roman" w:eastAsia="Times New Roman" w:hAnsi="Times New Roman" w:cs="Times New Roman"/>
@@ -5461,7 +5860,7 @@
         </w:rPr>
         <w:t>Ferramentas utilizadas</w:t>
       </w:r>
-      <w:bookmarkEnd w:id="13"/>
+      <w:bookmarkEnd w:id="17"/>
     </w:p>
     <w:p>
       <w:pPr>
@@ -5476,7 +5875,7 @@
           <w:lang w:eastAsia="pt-PT"/>
         </w:rPr>
       </w:pPr>
-      <w:bookmarkStart w:id="14" w:name="_Toc221641327"/>
+      <w:bookmarkStart w:id="18" w:name="_Toc225346786"/>
       <w:r>
         <w:rPr>
           <w:rFonts w:ascii="Times New Roman" w:eastAsia="Times New Roman" w:hAnsi="Times New Roman" w:cs="Times New Roman"/>
@@ -5511,7 +5910,7 @@
         </w:rPr>
         <w:t>Hardware</w:t>
       </w:r>
-      <w:bookmarkEnd w:id="14"/>
+      <w:bookmarkEnd w:id="18"/>
       <w:proofErr w:type="gramEnd"/>
     </w:p>
     <w:p>
@@ -5738,7 +6137,7 @@
           <w:lang w:eastAsia="pt-PT"/>
         </w:rPr>
       </w:pPr>
-      <w:bookmarkStart w:id="15" w:name="_Toc221641328"/>
+      <w:bookmarkStart w:id="19" w:name="_Toc225346787"/>
       <w:r>
         <w:rPr>
           <w:rFonts w:ascii="Times New Roman" w:eastAsia="Times New Roman" w:hAnsi="Times New Roman" w:cs="Times New Roman"/>
@@ -5773,7 +6172,7 @@
         </w:rPr>
         <w:t>Software</w:t>
       </w:r>
-      <w:bookmarkEnd w:id="15"/>
+      <w:bookmarkEnd w:id="19"/>
       <w:proofErr w:type="gramEnd"/>
     </w:p>
     <w:p>
@@ -6498,7 +6897,7 @@
           <w:lang w:eastAsia="pt-PT"/>
         </w:rPr>
       </w:pPr>
-      <w:bookmarkStart w:id="16" w:name="_Toc221641329"/>
+      <w:bookmarkStart w:id="20" w:name="_Toc225346788"/>
       <w:r>
         <w:rPr>
           <w:rFonts w:ascii="Times New Roman" w:eastAsia="Times New Roman" w:hAnsi="Times New Roman" w:cs="Times New Roman"/>
@@ -6521,7 +6920,7 @@
         </w:rPr>
         <w:t>Recursos Online e Ferramentas de Referência</w:t>
       </w:r>
-      <w:bookmarkEnd w:id="16"/>
+      <w:bookmarkEnd w:id="20"/>
     </w:p>
     <w:p>
       <w:pPr>
@@ -6706,7 +7105,7 @@
           <w:lang w:eastAsia="pt-PT"/>
         </w:rPr>
       </w:pPr>
-      <w:bookmarkStart w:id="17" w:name="_Toc221641331"/>
+      <w:bookmarkStart w:id="21" w:name="_Toc225346789"/>
       <w:r>
         <w:rPr>
           <w:rFonts w:ascii="Times New Roman" w:eastAsia="Times New Roman" w:hAnsi="Times New Roman" w:cs="Times New Roman"/>
@@ -6771,6 +7170,7 @@
         </w:rPr>
         <w:t>Godot</w:t>
       </w:r>
+      <w:bookmarkEnd w:id="21"/>
       <w:proofErr w:type="spellEnd"/>
       <w:r>
         <w:rPr>
@@ -6784,7 +7184,6 @@
         </w:rPr>
         <w:t xml:space="preserve"> </w:t>
       </w:r>
-      <w:bookmarkEnd w:id="17"/>
     </w:p>
     <w:p>
       <w:pPr>
@@ -7138,7 +7537,7 @@
           <w:numId w:val="3"/>
         </w:numPr>
       </w:pPr>
-      <w:bookmarkStart w:id="18" w:name="_Toc221641332"/>
+      <w:bookmarkStart w:id="22" w:name="_Toc225346790"/>
       <w:r>
         <w:rPr>
           <w:rStyle w:val="Forte"/>
@@ -7148,20 +7547,20 @@
         <w:lastRenderedPageBreak/>
         <w:t>Análise e Planeamento do Projeto</w:t>
       </w:r>
-      <w:bookmarkEnd w:id="18"/>
+      <w:bookmarkEnd w:id="22"/>
     </w:p>
     <w:p>
       <w:pPr>
         <w:pStyle w:val="Ttulo2"/>
       </w:pPr>
-      <w:bookmarkStart w:id="19" w:name="_Toc221641333"/>
+      <w:bookmarkStart w:id="23" w:name="_Toc225346791"/>
       <w:r>
         <w:t xml:space="preserve">7.1 </w:t>
       </w:r>
       <w:r>
         <w:t>Público-alvo</w:t>
       </w:r>
-      <w:bookmarkEnd w:id="19"/>
+      <w:bookmarkEnd w:id="23"/>
     </w:p>
     <w:p>
       <w:pPr>
@@ -7244,7 +7643,7 @@
       <w:pPr>
         <w:pStyle w:val="Ttulo2"/>
       </w:pPr>
-      <w:bookmarkStart w:id="20" w:name="_Toc221641334"/>
+      <w:bookmarkStart w:id="24" w:name="_Toc225346792"/>
       <w:r>
         <w:lastRenderedPageBreak/>
         <w:t>7</w:t>
@@ -7252,7 +7651,7 @@
       <w:r>
         <w:t>.2 Género e Mecânicas Principais</w:t>
       </w:r>
-      <w:bookmarkEnd w:id="20"/>
+      <w:bookmarkEnd w:id="24"/>
     </w:p>
     <w:p>
       <w:pPr>
@@ -7398,7 +7797,7 @@
       <w:pPr>
         <w:pStyle w:val="Ttulo2"/>
       </w:pPr>
-      <w:bookmarkStart w:id="21" w:name="_Toc221641335"/>
+      <w:bookmarkStart w:id="25" w:name="_Toc225346793"/>
       <w:r>
         <w:lastRenderedPageBreak/>
         <w:t>7</w:t>
@@ -7406,7 +7805,7 @@
       <w:r>
         <w:t>.3 Estrutura Geral do Jogo</w:t>
       </w:r>
-      <w:bookmarkEnd w:id="21"/>
+      <w:bookmarkEnd w:id="25"/>
     </w:p>
     <w:p>
       <w:pPr>
@@ -7531,7 +7930,7 @@
       <w:pPr>
         <w:pStyle w:val="Ttulo2"/>
       </w:pPr>
-      <w:bookmarkStart w:id="22" w:name="_Toc221641336"/>
+      <w:bookmarkStart w:id="26" w:name="_Toc225346794"/>
       <w:r>
         <w:lastRenderedPageBreak/>
         <w:t>7</w:t>
@@ -7539,7 +7938,7 @@
       <w:r>
         <w:t>.4 Organização das Cenas</w:t>
       </w:r>
-      <w:bookmarkEnd w:id="22"/>
+      <w:bookmarkEnd w:id="26"/>
     </w:p>
     <w:p>
       <w:pPr>
@@ -7669,14 +8068,14 @@
       <w:pPr>
         <w:pStyle w:val="Ttulo2"/>
       </w:pPr>
-      <w:bookmarkStart w:id="23" w:name="_Toc221641337"/>
+      <w:bookmarkStart w:id="27" w:name="_Toc225346795"/>
       <w:r>
         <w:t>7</w:t>
       </w:r>
       <w:r>
         <w:t>.5 Planeamento das Funcionalidades</w:t>
       </w:r>
-      <w:bookmarkEnd w:id="23"/>
+      <w:bookmarkEnd w:id="27"/>
     </w:p>
     <w:p>
       <w:pPr>
@@ -7799,7 +8198,7 @@
       <w:pPr>
         <w:pStyle w:val="Ttulo1"/>
       </w:pPr>
-      <w:bookmarkStart w:id="24" w:name="_Toc221641338"/>
+      <w:bookmarkStart w:id="28" w:name="_Toc225346796"/>
       <w:r>
         <w:rPr>
           <w:rStyle w:val="Forte"/>
@@ -7817,13 +8216,13 @@
         </w:rPr>
         <w:t>. Arquitetura Técnica do Jogo</w:t>
       </w:r>
-      <w:bookmarkEnd w:id="24"/>
+      <w:bookmarkEnd w:id="28"/>
     </w:p>
     <w:p>
       <w:pPr>
         <w:pStyle w:val="Ttulo2"/>
       </w:pPr>
-      <w:bookmarkStart w:id="25" w:name="_Toc221641339"/>
+      <w:bookmarkStart w:id="29" w:name="_Toc225346797"/>
       <w:r>
         <w:t>8</w:t>
       </w:r>
@@ -7834,7 +8233,7 @@
       <w:r>
         <w:t>Godot</w:t>
       </w:r>
-      <w:bookmarkEnd w:id="25"/>
+      <w:bookmarkEnd w:id="29"/>
       <w:proofErr w:type="spellEnd"/>
     </w:p>
     <w:p>
@@ -7998,7 +8397,7 @@
       <w:pPr>
         <w:pStyle w:val="Ttulo2"/>
       </w:pPr>
-      <w:bookmarkStart w:id="26" w:name="_Toc221641340"/>
+      <w:bookmarkStart w:id="30" w:name="_Toc225346798"/>
       <w:r>
         <w:lastRenderedPageBreak/>
         <w:t>8</w:t>
@@ -8006,7 +8405,7 @@
       <w:r>
         <w:t>.2 Sistema de Cenas e Modularidade</w:t>
       </w:r>
-      <w:bookmarkEnd w:id="26"/>
+      <w:bookmarkEnd w:id="30"/>
     </w:p>
     <w:p>
       <w:pPr>
@@ -8064,7 +8463,7 @@
       <w:pPr>
         <w:pStyle w:val="Ttulo2"/>
       </w:pPr>
-      <w:bookmarkStart w:id="27" w:name="_Toc221641341"/>
+      <w:bookmarkStart w:id="31" w:name="_Toc225346799"/>
       <w:r>
         <w:lastRenderedPageBreak/>
         <w:t>8</w:t>
@@ -8084,7 +8483,7 @@
       <w:r>
         <w:t>LevelTransition</w:t>
       </w:r>
-      <w:bookmarkEnd w:id="27"/>
+      <w:bookmarkEnd w:id="31"/>
       <w:proofErr w:type="spellEnd"/>
     </w:p>
     <w:p>
@@ -8270,7 +8669,7 @@
       <w:pPr>
         <w:pStyle w:val="Ttulo2"/>
       </w:pPr>
-      <w:bookmarkStart w:id="28" w:name="_Toc221641342"/>
+      <w:bookmarkStart w:id="32" w:name="_Toc225346800"/>
       <w:r>
         <w:lastRenderedPageBreak/>
         <w:t>8</w:t>
@@ -8278,7 +8677,7 @@
       <w:r>
         <w:t>.4 Máquina de Estados do Jogador</w:t>
       </w:r>
-      <w:bookmarkEnd w:id="28"/>
+      <w:bookmarkEnd w:id="32"/>
     </w:p>
     <w:p>
       <w:pPr>
@@ -8395,7 +8794,7 @@
       <w:pPr>
         <w:pStyle w:val="Ttulo2"/>
       </w:pPr>
-      <w:bookmarkStart w:id="29" w:name="_Toc221641343"/>
+      <w:bookmarkStart w:id="33" w:name="_Toc225346801"/>
       <w:r>
         <w:lastRenderedPageBreak/>
         <w:t>8</w:t>
@@ -8403,7 +8802,7 @@
       <w:r>
         <w:t>.5 Sistema de Animações</w:t>
       </w:r>
-      <w:bookmarkEnd w:id="29"/>
+      <w:bookmarkEnd w:id="33"/>
     </w:p>
     <w:p>
       <w:pPr>
@@ -8433,7 +8832,7 @@
       <w:pPr>
         <w:pStyle w:val="Ttulo2"/>
       </w:pPr>
-      <w:bookmarkStart w:id="30" w:name="_Toc221641344"/>
+      <w:bookmarkStart w:id="34" w:name="_Toc225346802"/>
       <w:r>
         <w:lastRenderedPageBreak/>
         <w:t>8</w:t>
@@ -8441,7 +8840,7 @@
       <w:r>
         <w:t>.6 Sistema de Colisões e Física</w:t>
       </w:r>
-      <w:bookmarkEnd w:id="30"/>
+      <w:bookmarkEnd w:id="34"/>
     </w:p>
     <w:p>
       <w:pPr>
@@ -8539,7 +8938,7 @@
       <w:pPr>
         <w:pStyle w:val="Ttulo1"/>
       </w:pPr>
-      <w:bookmarkStart w:id="31" w:name="_Toc221641345"/>
+      <w:bookmarkStart w:id="35" w:name="_Toc225346803"/>
       <w:r>
         <w:rPr>
           <w:rStyle w:val="Forte"/>
@@ -8557,20 +8956,20 @@
         </w:rPr>
         <w:t>. Problemas Encontrados e Resolução</w:t>
       </w:r>
-      <w:bookmarkEnd w:id="31"/>
+      <w:bookmarkEnd w:id="35"/>
     </w:p>
     <w:p>
       <w:pPr>
         <w:pStyle w:val="Ttulo2"/>
       </w:pPr>
-      <w:bookmarkStart w:id="32" w:name="_Toc221641346"/>
+      <w:bookmarkStart w:id="36" w:name="_Toc225346804"/>
       <w:r>
         <w:t>9</w:t>
       </w:r>
       <w:r>
         <w:t>.1 Problemas com Transições de Níveis</w:t>
       </w:r>
-      <w:bookmarkEnd w:id="32"/>
+      <w:bookmarkEnd w:id="36"/>
     </w:p>
     <w:p>
       <w:pPr>
@@ -8659,7 +9058,7 @@
       <w:pPr>
         <w:pStyle w:val="Ttulo2"/>
       </w:pPr>
-      <w:bookmarkStart w:id="33" w:name="_Toc221641347"/>
+      <w:bookmarkStart w:id="37" w:name="_Toc225346805"/>
       <w:r>
         <w:lastRenderedPageBreak/>
         <w:t>9</w:t>
@@ -8671,7 +9070,7 @@
       <w:r>
         <w:t>Runtime</w:t>
       </w:r>
-      <w:bookmarkEnd w:id="33"/>
+      <w:bookmarkEnd w:id="37"/>
       <w:proofErr w:type="spellEnd"/>
     </w:p>
     <w:p>
@@ -8795,7 +9194,7 @@
       <w:pPr>
         <w:pStyle w:val="Ttulo2"/>
       </w:pPr>
-      <w:bookmarkStart w:id="34" w:name="_Toc221641348"/>
+      <w:bookmarkStart w:id="38" w:name="_Toc225346806"/>
       <w:r>
         <w:lastRenderedPageBreak/>
         <w:t>9</w:t>
@@ -8803,7 +9202,7 @@
       <w:r>
         <w:t>.3 Loop de Transição Entre Cenas</w:t>
       </w:r>
-      <w:bookmarkEnd w:id="34"/>
+      <w:bookmarkEnd w:id="38"/>
     </w:p>
     <w:p>
       <w:pPr>
@@ -8873,7 +9272,7 @@
       <w:pPr>
         <w:pStyle w:val="Ttulo2"/>
       </w:pPr>
-      <w:bookmarkStart w:id="35" w:name="_Toc221641349"/>
+      <w:bookmarkStart w:id="39" w:name="_Toc225346807"/>
       <w:r>
         <w:lastRenderedPageBreak/>
         <w:t>9</w:t>
@@ -8885,7 +9284,7 @@
       <w:r>
         <w:t>One-Way</w:t>
       </w:r>
-      <w:bookmarkEnd w:id="35"/>
+      <w:bookmarkEnd w:id="39"/>
       <w:proofErr w:type="spellEnd"/>
     </w:p>
     <w:p>
@@ -8962,7 +9361,7 @@
       <w:pPr>
         <w:pStyle w:val="Ttulo2"/>
       </w:pPr>
-      <w:bookmarkStart w:id="36" w:name="_Toc221641350"/>
+      <w:bookmarkStart w:id="40" w:name="_Toc225346808"/>
       <w:r>
         <w:lastRenderedPageBreak/>
         <w:t>9</w:t>
@@ -8970,7 +9369,7 @@
       <w:r>
         <w:t>.5 Depuração e Resolução de Bugs</w:t>
       </w:r>
-      <w:bookmarkEnd w:id="36"/>
+      <w:bookmarkEnd w:id="40"/>
     </w:p>
     <w:p>
       <w:pPr>
@@ -9050,6 +9449,56 @@
     </w:sectPr>
   </w:body>
 </w:document>
+</file>
+
+<file path=word/endnotes.xml><?xml version="1.0" encoding="utf-8"?>
+<w:endnotes xmlns:wpc="http://schemas.microsoft.com/office/word/2010/wordprocessingCanvas" xmlns:cx="http://schemas.microsoft.com/office/drawing/2014/chartex" xmlns:cx1="http://schemas.microsoft.com/office/drawing/2015/9/8/chartex" xmlns:cx2="http://schemas.microsoft.com/office/drawing/2015/10/21/chartex" xmlns:cx3="http://schemas.microsoft.com/office/drawing/2016/5/9/chartex" xmlns:cx4="http://schemas.microsoft.com/office/drawing/2016/5/10/chartex" xmlns:cx5="http://schemas.microsoft.com/office/drawing/2016/5/11/chartex" xmlns:cx6="http://schemas.microsoft.com/office/drawing/2016/5/12/chartex" xmlns:cx7="http://schemas.microsoft.com/office/drawing/2016/5/13/chartex" xmlns:cx8="http://schemas.microsoft.com/office/drawing/2016/5/14/chartex" xmlns:mc="http://schemas.openxmlformats.org/markup-compatibility/2006" xmlns:aink="http://schemas.microsoft.com/office/drawing/2016/ink" xmlns:am3d="http://schemas.microsoft.com/office/drawing/2017/model3d" xmlns:o="urn:schemas-microsoft-com:office:office" xmlns:r="http://schemas.openxmlformats.org/officeDocument/2006/relationships" xmlns:m="http://schemas.openxmlformats.org/officeDocument/2006/math" xmlns:v="urn:schemas-microsoft-com:vml" xmlns:wp14="http://schemas.microsoft.com/office/word/2010/wordprocessingDrawing" xmlns:wp="http://schemas.openxmlformats.org/drawingml/2006/wordprocessingDrawing" xmlns:w10="urn:schemas-microsoft-com:office:word" xmlns:w="http://schemas.openxmlformats.org/wordprocessingml/2006/main" xmlns:w14="http://schemas.microsoft.com/office/word/2010/wordml" xmlns:w15="http://schemas.microsoft.com/office/word/2012/wordml" xmlns:w16cex="http://schemas.microsoft.com/office/word/2018/wordml/cex" xmlns:w16cid="http://schemas.microsoft.com/office/word/2016/wordml/cid" xmlns:w16="http://schemas.microsoft.com/office/word/2018/wordml" xmlns:w16sdtdh="http://schemas.microsoft.com/office/word/2020/wordml/sdtdatahash" xmlns:w16se="http://schemas.microsoft.com/office/word/2015/wordml/symex" xmlns:wpg="http://schemas.microsoft.com/office/word/2010/wordprocessingGroup" xmlns:wpi="http://schemas.microsoft.com/office/word/2010/wordprocessingInk" xmlns:wne="http://schemas.microsoft.com/office/word/2006/wordml" xmlns:wps="http://schemas.microsoft.com/office/word/2010/wordprocessingShape" mc:Ignorable="w14 w15 w16se w16cid w16 w16cex w16sdtdh wp14">
+  <w:endnote w:type="separator" w:id="-1">
+    <w:p>
+      <w:pPr>
+        <w:spacing w:after="0" w:line="240" w:lineRule="auto"/>
+      </w:pPr>
+      <w:r>
+        <w:separator/>
+      </w:r>
+    </w:p>
+  </w:endnote>
+  <w:endnote w:type="continuationSeparator" w:id="0">
+    <w:p>
+      <w:pPr>
+        <w:spacing w:after="0" w:line="240" w:lineRule="auto"/>
+      </w:pPr>
+      <w:r>
+        <w:continuationSeparator/>
+      </w:r>
+    </w:p>
+  </w:endnote>
+</w:endnotes>
+</file>
+
+<file path=word/footnotes.xml><?xml version="1.0" encoding="utf-8"?>
+<w:footnotes xmlns:wpc="http://schemas.microsoft.com/office/word/2010/wordprocessingCanvas" xmlns:cx="http://schemas.microsoft.com/office/drawing/2014/chartex" xmlns:cx1="http://schemas.microsoft.com/office/drawing/2015/9/8/chartex" xmlns:cx2="http://schemas.microsoft.com/office/drawing/2015/10/21/chartex" xmlns:cx3="http://schemas.microsoft.com/office/drawing/2016/5/9/chartex" xmlns:cx4="http://schemas.microsoft.com/office/drawing/2016/5/10/chartex" xmlns:cx5="http://schemas.microsoft.com/office/drawing/2016/5/11/chartex" xmlns:cx6="http://schemas.microsoft.com/office/drawing/2016/5/12/chartex" xmlns:cx7="http://schemas.microsoft.com/office/drawing/2016/5/13/chartex" xmlns:cx8="http://schemas.microsoft.com/office/drawing/2016/5/14/chartex" xmlns:mc="http://schemas.openxmlformats.org/markup-compatibility/2006" xmlns:aink="http://schemas.microsoft.com/office/drawing/2016/ink" xmlns:am3d="http://schemas.microsoft.com/office/drawing/2017/model3d" xmlns:o="urn:schemas-microsoft-com:office:office" xmlns:r="http://schemas.openxmlformats.org/officeDocument/2006/relationships" xmlns:m="http://schemas.openxmlformats.org/officeDocument/2006/math" xmlns:v="urn:schemas-microsoft-com:vml" xmlns:wp14="http://schemas.microsoft.com/office/word/2010/wordprocessingDrawing" xmlns:wp="http://schemas.openxmlformats.org/drawingml/2006/wordprocessingDrawing" xmlns:w10="urn:schemas-microsoft-com:office:word" xmlns:w="http://schemas.openxmlformats.org/wordprocessingml/2006/main" xmlns:w14="http://schemas.microsoft.com/office/word/2010/wordml" xmlns:w15="http://schemas.microsoft.com/office/word/2012/wordml" xmlns:w16cex="http://schemas.microsoft.com/office/word/2018/wordml/cex" xmlns:w16cid="http://schemas.microsoft.com/office/word/2016/wordml/cid" xmlns:w16="http://schemas.microsoft.com/office/word/2018/wordml" xmlns:w16sdtdh="http://schemas.microsoft.com/office/word/2020/wordml/sdtdatahash" xmlns:w16se="http://schemas.microsoft.com/office/word/2015/wordml/symex" xmlns:wpg="http://schemas.microsoft.com/office/word/2010/wordprocessingGroup" xmlns:wpi="http://schemas.microsoft.com/office/word/2010/wordprocessingInk" xmlns:wne="http://schemas.microsoft.com/office/word/2006/wordml" xmlns:wps="http://schemas.microsoft.com/office/word/2010/wordprocessingShape" mc:Ignorable="w14 w15 w16se w16cid w16 w16cex w16sdtdh wp14">
+  <w:footnote w:type="separator" w:id="-1">
+    <w:p>
+      <w:pPr>
+        <w:spacing w:after="0" w:line="240" w:lineRule="auto"/>
+      </w:pPr>
+      <w:r>
+        <w:separator/>
+      </w:r>
+    </w:p>
+  </w:footnote>
+  <w:footnote w:type="continuationSeparator" w:id="0">
+    <w:p>
+      <w:pPr>
+        <w:spacing w:after="0" w:line="240" w:lineRule="auto"/>
+      </w:pPr>
+      <w:r>
+        <w:continuationSeparator/>
+      </w:r>
+    </w:p>
+  </w:footnote>
+</w:footnotes>
 </file>
 
 <file path=word/numbering.xml><?xml version="1.0" encoding="utf-8"?>
@@ -14138,6 +14587,50 @@
       <w:szCs w:val="20"/>
     </w:rPr>
   </w:style>
+  <w:style w:type="paragraph" w:styleId="Cabealho">
+    <w:name w:val="header"/>
+    <w:basedOn w:val="Normal"/>
+    <w:link w:val="CabealhoCarter"/>
+    <w:uiPriority w:val="99"/>
+    <w:unhideWhenUsed/>
+    <w:rsid w:val="00E900A9"/>
+    <w:pPr>
+      <w:tabs>
+        <w:tab w:val="center" w:pos="4252"/>
+        <w:tab w:val="right" w:pos="8504"/>
+      </w:tabs>
+      <w:spacing w:after="0" w:line="240" w:lineRule="auto"/>
+    </w:pPr>
+  </w:style>
+  <w:style w:type="character" w:customStyle="1" w:styleId="CabealhoCarter">
+    <w:name w:val="Cabeçalho Caráter"/>
+    <w:basedOn w:val="Tipodeletrapredefinidodopargrafo"/>
+    <w:link w:val="Cabealho"/>
+    <w:uiPriority w:val="99"/>
+    <w:rsid w:val="00E900A9"/>
+  </w:style>
+  <w:style w:type="paragraph" w:styleId="Rodap">
+    <w:name w:val="footer"/>
+    <w:basedOn w:val="Normal"/>
+    <w:link w:val="RodapCarter"/>
+    <w:uiPriority w:val="99"/>
+    <w:unhideWhenUsed/>
+    <w:rsid w:val="00E900A9"/>
+    <w:pPr>
+      <w:tabs>
+        <w:tab w:val="center" w:pos="4252"/>
+        <w:tab w:val="right" w:pos="8504"/>
+      </w:tabs>
+      <w:spacing w:after="0" w:line="240" w:lineRule="auto"/>
+    </w:pPr>
+  </w:style>
+  <w:style w:type="character" w:customStyle="1" w:styleId="RodapCarter">
+    <w:name w:val="Rodapé Caráter"/>
+    <w:basedOn w:val="Tipodeletrapredefinidodopargrafo"/>
+    <w:link w:val="Rodap"/>
+    <w:uiPriority w:val="99"/>
+    <w:rsid w:val="00E900A9"/>
+  </w:style>
 </w:styles>
 </file>
 

</xml_diff>